<commit_message>
Corrección Planillas de Casos de Uso
</commit_message>
<xml_diff>
--- a/Diagramas de Casos de Uso - Panify.docx
+++ b/Diagramas de Casos de Uso - Panify.docx
@@ -303,12 +303,12 @@
             <wp:extent cx="7124700" cy="4634230"/>
             <wp:effectExtent b="0" l="0" r="0" t="0"/>
             <wp:wrapNone/>
-            <wp:docPr id="13" name="image1.png"/>
+            <wp:docPr id="12" name="image3.png"/>
             <a:graphic>
               <a:graphicData uri="http://schemas.openxmlformats.org/drawingml/2006/picture">
                 <pic:pic>
                   <pic:nvPicPr>
-                    <pic:cNvPr id="0" name="image1.png"/>
+                    <pic:cNvPr id="0" name="image3.png"/>
                     <pic:cNvPicPr preferRelativeResize="0"/>
                   </pic:nvPicPr>
                   <pic:blipFill>
@@ -1918,6 +1918,7 @@
     <w:tbl>
       <w:tblPr>
         <w:tblStyle w:val="Table2"/>
+        <w:tblpPr w:leftFromText="180" w:rightFromText="180" w:topFromText="180" w:bottomFromText="180" w:vertAnchor="text" w:horzAnchor="text" w:tblpX="-860.9999999999997" w:tblpY="0"/>
         <w:tblW w:w="10483.0" w:type="dxa"/>
         <w:jc w:val="left"/>
         <w:tblInd w:w="-854.0" w:type="dxa"/>
@@ -2385,21 +2386,8 @@
           </w:tcPr>
           <w:p>
             <w:pPr>
-              <w:keepNext w:val="0"/>
-              <w:keepLines w:val="0"/>
-              <w:pageBreakBefore w:val="0"/>
-              <w:widowControl w:val="0"/>
-              <w:pBdr>
-                <w:top w:space="0" w:sz="0" w:val="nil"/>
-                <w:left w:space="0" w:sz="0" w:val="nil"/>
-                <w:bottom w:space="0" w:sz="0" w:val="nil"/>
-                <w:right w:space="0" w:sz="0" w:val="nil"/>
-                <w:between w:space="0" w:sz="0" w:val="nil"/>
-              </w:pBdr>
-              <w:shd w:fill="auto" w:val="clear"/>
-              <w:spacing w:after="0" w:before="0" w:line="276" w:lineRule="auto"/>
-              <w:ind w:left="0" w:right="0" w:firstLine="0"/>
-              <w:jc w:val="left"/>
+              <w:widowControl w:val="0"/>
+              <w:spacing w:after="0" w:line="276" w:lineRule="auto"/>
               <w:rPr>
                 <w:b w:val="1"/>
                 <w:bCs w:val="1"/>
@@ -2515,21 +2503,8 @@
           </w:tcPr>
           <w:p>
             <w:pPr>
-              <w:keepNext w:val="0"/>
-              <w:keepLines w:val="0"/>
-              <w:pageBreakBefore w:val="0"/>
-              <w:widowControl w:val="0"/>
-              <w:pBdr>
-                <w:top w:space="0" w:sz="0" w:val="nil"/>
-                <w:left w:space="0" w:sz="0" w:val="nil"/>
-                <w:bottom w:space="0" w:sz="0" w:val="nil"/>
-                <w:right w:space="0" w:sz="0" w:val="nil"/>
-                <w:between w:space="0" w:sz="0" w:val="nil"/>
-              </w:pBdr>
-              <w:shd w:fill="auto" w:val="clear"/>
-              <w:spacing w:after="0" w:before="0" w:line="276" w:lineRule="auto"/>
-              <w:ind w:left="0" w:right="0" w:firstLine="0"/>
-              <w:jc w:val="left"/>
+              <w:widowControl w:val="0"/>
+              <w:spacing w:after="0" w:line="276" w:lineRule="auto"/>
               <w:rPr/>
             </w:pPr>
             <w:r>
@@ -2642,21 +2617,8 @@
           </w:tcPr>
           <w:p>
             <w:pPr>
-              <w:keepNext w:val="0"/>
-              <w:keepLines w:val="0"/>
-              <w:pageBreakBefore w:val="0"/>
-              <w:widowControl w:val="0"/>
-              <w:pBdr>
-                <w:top w:space="0" w:sz="0" w:val="nil"/>
-                <w:left w:space="0" w:sz="0" w:val="nil"/>
-                <w:bottom w:space="0" w:sz="0" w:val="nil"/>
-                <w:right w:space="0" w:sz="0" w:val="nil"/>
-                <w:between w:space="0" w:sz="0" w:val="nil"/>
-              </w:pBdr>
-              <w:shd w:fill="auto" w:val="clear"/>
-              <w:spacing w:after="0" w:before="0" w:line="276" w:lineRule="auto"/>
-              <w:ind w:left="0" w:right="0" w:firstLine="0"/>
-              <w:jc w:val="left"/>
+              <w:widowControl w:val="0"/>
+              <w:spacing w:after="0" w:line="276" w:lineRule="auto"/>
               <w:rPr/>
             </w:pPr>
             <w:r>
@@ -2883,21 +2845,8 @@
           </w:tcPr>
           <w:p>
             <w:pPr>
-              <w:keepNext w:val="0"/>
-              <w:keepLines w:val="0"/>
-              <w:pageBreakBefore w:val="0"/>
-              <w:widowControl w:val="0"/>
-              <w:pBdr>
-                <w:top w:space="0" w:sz="0" w:val="nil"/>
-                <w:left w:space="0" w:sz="0" w:val="nil"/>
-                <w:bottom w:space="0" w:sz="0" w:val="nil"/>
-                <w:right w:space="0" w:sz="0" w:val="nil"/>
-                <w:between w:space="0" w:sz="0" w:val="nil"/>
-              </w:pBdr>
-              <w:shd w:fill="auto" w:val="clear"/>
-              <w:spacing w:after="0" w:before="0" w:line="276" w:lineRule="auto"/>
-              <w:ind w:left="0" w:right="0" w:firstLine="0"/>
-              <w:jc w:val="left"/>
+              <w:widowControl w:val="0"/>
+              <w:spacing w:after="0" w:line="276" w:lineRule="auto"/>
               <w:rPr>
                 <w:b w:val="1"/>
                 <w:bCs w:val="1"/>
@@ -3005,21 +2954,8 @@
           </w:tcPr>
           <w:p>
             <w:pPr>
-              <w:keepNext w:val="0"/>
-              <w:keepLines w:val="0"/>
-              <w:pageBreakBefore w:val="0"/>
-              <w:widowControl w:val="0"/>
-              <w:pBdr>
-                <w:top w:space="0" w:sz="0" w:val="nil"/>
-                <w:left w:space="0" w:sz="0" w:val="nil"/>
-                <w:bottom w:space="0" w:sz="0" w:val="nil"/>
-                <w:right w:space="0" w:sz="0" w:val="nil"/>
-                <w:between w:space="0" w:sz="0" w:val="nil"/>
-              </w:pBdr>
-              <w:shd w:fill="auto" w:val="clear"/>
-              <w:spacing w:after="0" w:before="0" w:line="276" w:lineRule="auto"/>
-              <w:ind w:left="0" w:right="0" w:firstLine="0"/>
-              <w:jc w:val="left"/>
+              <w:widowControl w:val="0"/>
+              <w:spacing w:after="0" w:line="276" w:lineRule="auto"/>
               <w:rPr/>
             </w:pPr>
             <w:r>
@@ -4627,7 +4563,7 @@
             <wp:extent cx="7376160" cy="4371975"/>
             <wp:effectExtent b="0" l="0" r="0" t="0"/>
             <wp:wrapNone/>
-            <wp:docPr id="12" name="image4.png"/>
+            <wp:docPr id="11" name="image4.png"/>
             <a:graphic>
               <a:graphicData uri="http://schemas.openxmlformats.org/drawingml/2006/picture">
                 <pic:pic>
@@ -9443,7 +9379,7 @@
               <w:rPr>
                 <w:rtl w:val="0"/>
               </w:rPr>
-              <w:t xml:space="preserve">Garantiza que precios, descripciones y disponibilidad se mantengan correctos en el sistema.</w:t>
+              <w:t xml:space="preserve">Garantiza que los precios, descripciones y disponibilidad se mantengan correctos en el sistema.</w:t>
             </w:r>
           </w:p>
         </w:tc>
@@ -9473,6 +9409,48 @@
         </w:rPr>
         <w:t xml:space="preserve">Módulo 3 – Gestión de Pedidos</w:t>
       </w:r>
+      <w:r>
+        <w:drawing>
+          <wp:anchor allowOverlap="1" behindDoc="0" distB="114300" distT="114300" distL="114300" distR="114300" hidden="0" layoutInCell="1" locked="0" relativeHeight="0" simplePos="0">
+            <wp:simplePos x="0" y="0"/>
+            <wp:positionH relativeFrom="column">
+              <wp:posOffset>-796924</wp:posOffset>
+            </wp:positionH>
+            <wp:positionV relativeFrom="paragraph">
+              <wp:posOffset>7244125</wp:posOffset>
+            </wp:positionV>
+            <wp:extent cx="7379436" cy="3708511"/>
+            <wp:effectExtent b="0" l="0" r="0" t="0"/>
+            <wp:wrapNone/>
+            <wp:docPr id="15" name="image2.png"/>
+            <a:graphic>
+              <a:graphicData uri="http://schemas.openxmlformats.org/drawingml/2006/picture">
+                <pic:pic>
+                  <pic:nvPicPr>
+                    <pic:cNvPr id="0" name="image2.png"/>
+                    <pic:cNvPicPr preferRelativeResize="0"/>
+                  </pic:nvPicPr>
+                  <pic:blipFill>
+                    <a:blip r:embed="rId9"/>
+                    <a:srcRect b="0" l="0" r="0" t="0"/>
+                    <a:stretch>
+                      <a:fillRect/>
+                    </a:stretch>
+                  </pic:blipFill>
+                  <pic:spPr>
+                    <a:xfrm>
+                      <a:off x="0" y="0"/>
+                      <a:ext cx="7379436" cy="3708511"/>
+                    </a:xfrm>
+                    <a:prstGeom prst="rect"/>
+                    <a:ln/>
+                  </pic:spPr>
+                </pic:pic>
+              </a:graphicData>
+            </a:graphic>
+          </wp:anchor>
+        </w:drawing>
+      </w:r>
     </w:p>
     <w:p>
       <w:pPr>
@@ -9485,48 +9463,6 @@
         <w:rPr>
           <w:rtl w:val="0"/>
         </w:rPr>
-      </w:r>
-      <w:r>
-        <w:drawing>
-          <wp:anchor allowOverlap="1" behindDoc="0" distB="114300" distT="114300" distL="114300" distR="114300" hidden="0" layoutInCell="1" locked="0" relativeHeight="0" simplePos="0">
-            <wp:simplePos x="0" y="0"/>
-            <wp:positionH relativeFrom="column">
-              <wp:posOffset>-1022984</wp:posOffset>
-            </wp:positionH>
-            <wp:positionV relativeFrom="paragraph">
-              <wp:posOffset>152400</wp:posOffset>
-            </wp:positionV>
-            <wp:extent cx="7659053" cy="3544756"/>
-            <wp:effectExtent b="0" l="0" r="0" t="0"/>
-            <wp:wrapNone/>
-            <wp:docPr id="11" name="image2.png"/>
-            <a:graphic>
-              <a:graphicData uri="http://schemas.openxmlformats.org/drawingml/2006/picture">
-                <pic:pic>
-                  <pic:nvPicPr>
-                    <pic:cNvPr id="0" name="image2.png"/>
-                    <pic:cNvPicPr preferRelativeResize="0"/>
-                  </pic:nvPicPr>
-                  <pic:blipFill>
-                    <a:blip r:embed="rId9"/>
-                    <a:srcRect b="-3799" l="-1887" r="-7835" t="-4958"/>
-                    <a:stretch>
-                      <a:fillRect/>
-                    </a:stretch>
-                  </pic:blipFill>
-                  <pic:spPr>
-                    <a:xfrm>
-                      <a:off x="0" y="0"/>
-                      <a:ext cx="7659053" cy="3544756"/>
-                    </a:xfrm>
-                    <a:prstGeom prst="rect"/>
-                    <a:ln/>
-                  </pic:spPr>
-                </pic:pic>
-              </a:graphicData>
-            </a:graphic>
-          </wp:anchor>
-        </w:drawing>
       </w:r>
     </w:p>
     <w:tbl>
@@ -10915,9 +10851,6 @@
       <w:pPr>
         <w:rPr/>
       </w:pPr>
-      <w:r>
-        <w:br w:type="page"/>
-      </w:r>
       <w:r>
         <w:rPr>
           <w:rtl w:val="0"/>
@@ -12063,9 +11996,6 @@
         <w:rPr/>
       </w:pPr>
       <w:r>
-        <w:br w:type="page"/>
-      </w:r>
-      <w:r>
         <w:rPr>
           <w:rtl w:val="0"/>
         </w:rPr>
@@ -13210,9 +13140,6 @@
       <w:pPr>
         <w:rPr/>
       </w:pPr>
-      <w:r>
-        <w:br w:type="page"/>
-      </w:r>
       <w:r>
         <w:rPr>
           <w:rtl w:val="0"/>
@@ -17295,32 +17222,47 @@
             </w:pPr>
             <w:r>
               <w:rPr>
-                <w:rtl w:val="0"/>
-              </w:rPr>
-              <w:t xml:space="preserve">Seleccionar pedido</w:t>
-            </w:r>
-          </w:p>
-        </w:tc>
-        <w:tc>
-          <w:tcPr>
-            <w:tcMar>
-              <w:top w:w="100.0" w:type="dxa"/>
-              <w:left w:w="100.0" w:type="dxa"/>
-              <w:bottom w:w="100.0" w:type="dxa"/>
-              <w:right w:w="100.0" w:type="dxa"/>
-            </w:tcMar>
-          </w:tcPr>
-          <w:p>
-            <w:pPr>
-              <w:widowControl w:val="0"/>
-              <w:spacing w:line="240" w:lineRule="auto"/>
-              <w:rPr/>
-            </w:pPr>
-            <w:r>
-              <w:rPr>
-                <w:rtl w:val="0"/>
-              </w:rPr>
-              <w:t xml:space="preserve">El sistema muestra estado actual</w:t>
+                <w:color w:val="0d0d0d"/>
+                <w:highlight w:val="white"/>
+                <w:rtl w:val="0"/>
+              </w:rPr>
+              <w:t xml:space="preserve">El usuario selecciona un pedido de la lista disponible, con el fin de visualizar su información o realizar acciones sobre él</w:t>
+            </w:r>
+            <w:r>
+              <w:rPr>
+                <w:rtl w:val="0"/>
+              </w:rPr>
+            </w:r>
+          </w:p>
+        </w:tc>
+        <w:tc>
+          <w:tcPr>
+            <w:tcMar>
+              <w:top w:w="100.0" w:type="dxa"/>
+              <w:left w:w="100.0" w:type="dxa"/>
+              <w:bottom w:w="100.0" w:type="dxa"/>
+              <w:right w:w="100.0" w:type="dxa"/>
+            </w:tcMar>
+          </w:tcPr>
+          <w:p>
+            <w:pPr>
+              <w:widowControl w:val="0"/>
+              <w:spacing w:line="240" w:lineRule="auto"/>
+              <w:rPr/>
+            </w:pPr>
+            <w:r>
+              <w:rPr>
+                <w:color w:val="0d0d0d"/>
+                <w:highlight w:val="white"/>
+                <w:rtl w:val="0"/>
+              </w:rPr>
+              <w:t xml:space="preserve">El sistema despliega el estado actual del pedido, permitiendo al usuario visualizar su situación dentro del proceso.</w:t>
+            </w:r>
+            <w:r>
+              <w:rPr>
+                <w:rtl w:val="0"/>
+              </w:rPr>
+              <w:t xml:space="preserve">l</w:t>
             </w:r>
           </w:p>
         </w:tc>
@@ -17407,32 +17349,46 @@
             </w:pPr>
             <w:r>
               <w:rPr>
-                <w:rtl w:val="0"/>
-              </w:rPr>
-              <w:t xml:space="preserve">Cambiar estado</w:t>
-            </w:r>
-          </w:p>
-        </w:tc>
-        <w:tc>
-          <w:tcPr>
-            <w:tcMar>
-              <w:top w:w="100.0" w:type="dxa"/>
-              <w:left w:w="100.0" w:type="dxa"/>
-              <w:bottom w:w="100.0" w:type="dxa"/>
-              <w:right w:w="100.0" w:type="dxa"/>
-            </w:tcMar>
-          </w:tcPr>
-          <w:p>
-            <w:pPr>
-              <w:widowControl w:val="0"/>
-              <w:spacing w:line="240" w:lineRule="auto"/>
-              <w:rPr/>
-            </w:pPr>
-            <w:r>
-              <w:rPr>
-                <w:rtl w:val="0"/>
-              </w:rPr>
-              <w:t xml:space="preserve">El sistema valida transición</w:t>
+                <w:color w:val="0d0d0d"/>
+                <w:highlight w:val="white"/>
+                <w:rtl w:val="0"/>
+              </w:rPr>
+              <w:t xml:space="preserve">El sistema actualiza el estado del pedido según la acción realizada, reflejando el cambio en la información almacenada.</w:t>
+            </w:r>
+            <w:r>
+              <w:rPr>
+                <w:rtl w:val="0"/>
+              </w:rPr>
+            </w:r>
+          </w:p>
+        </w:tc>
+        <w:tc>
+          <w:tcPr>
+            <w:tcMar>
+              <w:top w:w="100.0" w:type="dxa"/>
+              <w:left w:w="100.0" w:type="dxa"/>
+              <w:bottom w:w="100.0" w:type="dxa"/>
+              <w:right w:w="100.0" w:type="dxa"/>
+            </w:tcMar>
+          </w:tcPr>
+          <w:p>
+            <w:pPr>
+              <w:widowControl w:val="0"/>
+              <w:spacing w:line="240" w:lineRule="auto"/>
+              <w:rPr/>
+            </w:pPr>
+            <w:r>
+              <w:rPr>
+                <w:color w:val="0d0d0d"/>
+                <w:highlight w:val="white"/>
+                <w:rtl w:val="0"/>
+              </w:rPr>
+              <w:t xml:space="preserve">El sistema verifica que el cambio de estado del pedido sea válido según las reglas establecidas, asegurando la coherencia del proceso antes de aplicarlo</w:t>
+            </w:r>
+            <w:r>
+              <w:rPr>
+                <w:rtl w:val="0"/>
+              </w:rPr>
             </w:r>
           </w:p>
         </w:tc>
@@ -17519,9 +17475,16 @@
             </w:pPr>
             <w:r>
               <w:rPr>
-                <w:rtl w:val="0"/>
-              </w:rPr>
-              <w:t xml:space="preserve">Guardar cambio</w:t>
+                <w:color w:val="0d0d0d"/>
+                <w:highlight w:val="white"/>
+                <w:rtl w:val="0"/>
+              </w:rPr>
+              <w:t xml:space="preserve">El sistema almacena los cambios efectuados en la información, asegurando su correcta persistencia en la base de datos.</w:t>
+            </w:r>
+            <w:r>
+              <w:rPr>
+                <w:rtl w:val="0"/>
+              </w:rPr>
             </w:r>
           </w:p>
         </w:tc>
@@ -17747,32 +17710,46 @@
             </w:pPr>
             <w:r>
               <w:rPr>
-                <w:rtl w:val="0"/>
-              </w:rPr>
-              <w:t xml:space="preserve">Estado inválido</w:t>
-            </w:r>
-          </w:p>
-        </w:tc>
-        <w:tc>
-          <w:tcPr>
-            <w:tcMar>
-              <w:top w:w="100.0" w:type="dxa"/>
-              <w:left w:w="100.0" w:type="dxa"/>
-              <w:bottom w:w="100.0" w:type="dxa"/>
-              <w:right w:w="100.0" w:type="dxa"/>
-            </w:tcMar>
-          </w:tcPr>
-          <w:p>
-            <w:pPr>
-              <w:widowControl w:val="0"/>
-              <w:spacing w:line="240" w:lineRule="auto"/>
-              <w:rPr/>
-            </w:pPr>
-            <w:r>
-              <w:rPr>
-                <w:rtl w:val="0"/>
-              </w:rPr>
-              <w:t xml:space="preserve">Bloquea cambio</w:t>
+                <w:color w:val="0d0d0d"/>
+                <w:highlight w:val="white"/>
+                <w:rtl w:val="0"/>
+              </w:rPr>
+              <w:t xml:space="preserve">Si el sistema detecta que el estado proporcionado no es válido según las reglas definidas, se bloquea la actualización y se notifica al usuario para que ingrese un estado correcto.”</w:t>
+            </w:r>
+            <w:r>
+              <w:rPr>
+                <w:rtl w:val="0"/>
+              </w:rPr>
+            </w:r>
+          </w:p>
+        </w:tc>
+        <w:tc>
+          <w:tcPr>
+            <w:tcMar>
+              <w:top w:w="100.0" w:type="dxa"/>
+              <w:left w:w="100.0" w:type="dxa"/>
+              <w:bottom w:w="100.0" w:type="dxa"/>
+              <w:right w:w="100.0" w:type="dxa"/>
+            </w:tcMar>
+          </w:tcPr>
+          <w:p>
+            <w:pPr>
+              <w:widowControl w:val="0"/>
+              <w:spacing w:line="240" w:lineRule="auto"/>
+              <w:rPr/>
+            </w:pPr>
+            <w:r>
+              <w:rPr>
+                <w:color w:val="0d0d0d"/>
+                <w:highlight w:val="white"/>
+                <w:rtl w:val="0"/>
+              </w:rPr>
+              <w:t xml:space="preserve">El sistema impide la modificación del estado del pedido al no cumplirse las condiciones requeridas, manteniendo la información sin cambios</w:t>
+            </w:r>
+            <w:r>
+              <w:rPr>
+                <w:rtl w:val="0"/>
+              </w:rPr>
             </w:r>
           </w:p>
         </w:tc>
@@ -17858,32 +17835,46 @@
             </w:pPr>
             <w:r>
               <w:rPr>
-                <w:rtl w:val="0"/>
-              </w:rPr>
-              <w:t xml:space="preserve">Pedido inexistente</w:t>
-            </w:r>
-          </w:p>
-        </w:tc>
-        <w:tc>
-          <w:tcPr>
-            <w:tcMar>
-              <w:top w:w="100.0" w:type="dxa"/>
-              <w:left w:w="100.0" w:type="dxa"/>
-              <w:bottom w:w="100.0" w:type="dxa"/>
-              <w:right w:w="100.0" w:type="dxa"/>
-            </w:tcMar>
-          </w:tcPr>
-          <w:p>
-            <w:pPr>
-              <w:widowControl w:val="0"/>
-              <w:spacing w:line="240" w:lineRule="auto"/>
-              <w:rPr/>
-            </w:pPr>
-            <w:r>
-              <w:rPr>
-                <w:rtl w:val="0"/>
-              </w:rPr>
-              <w:t xml:space="preserve">Muestra error</w:t>
+                <w:color w:val="0d0d0d"/>
+                <w:highlight w:val="white"/>
+                <w:rtl w:val="0"/>
+              </w:rPr>
+              <w:t xml:space="preserve">Si el sistema no encuentra el pedido en la base de datos, se bloquea el proceso y se notifica al usuario que el pedido es inexistente.</w:t>
+            </w:r>
+            <w:r>
+              <w:rPr>
+                <w:rtl w:val="0"/>
+              </w:rPr>
+            </w:r>
+          </w:p>
+        </w:tc>
+        <w:tc>
+          <w:tcPr>
+            <w:tcMar>
+              <w:top w:w="100.0" w:type="dxa"/>
+              <w:left w:w="100.0" w:type="dxa"/>
+              <w:bottom w:w="100.0" w:type="dxa"/>
+              <w:right w:w="100.0" w:type="dxa"/>
+            </w:tcMar>
+          </w:tcPr>
+          <w:p>
+            <w:pPr>
+              <w:widowControl w:val="0"/>
+              <w:spacing w:line="240" w:lineRule="auto"/>
+              <w:rPr/>
+            </w:pPr>
+            <w:r>
+              <w:rPr>
+                <w:color w:val="0d0d0d"/>
+                <w:highlight w:val="white"/>
+                <w:rtl w:val="0"/>
+              </w:rPr>
+              <w:t xml:space="preserve">El sistema despliega un mensaje de error notificando que ocurrió una falla durante el proceso, impidiendo completar la acción solicitada.</w:t>
+            </w:r>
+            <w:r>
+              <w:rPr>
+                <w:rtl w:val="0"/>
+              </w:rPr>
             </w:r>
           </w:p>
         </w:tc>
@@ -18628,32 +18619,46 @@
             </w:pPr>
             <w:r>
               <w:rPr>
-                <w:rtl w:val="0"/>
-              </w:rPr>
-              <w:t xml:space="preserve">Solicita pedidos</w:t>
-            </w:r>
-          </w:p>
-        </w:tc>
-        <w:tc>
-          <w:tcPr>
-            <w:tcMar>
-              <w:top w:w="100.0" w:type="dxa"/>
-              <w:left w:w="100.0" w:type="dxa"/>
-              <w:bottom w:w="100.0" w:type="dxa"/>
-              <w:right w:w="100.0" w:type="dxa"/>
-            </w:tcMar>
-          </w:tcPr>
-          <w:p>
-            <w:pPr>
-              <w:widowControl w:val="0"/>
-              <w:spacing w:line="240" w:lineRule="auto"/>
-              <w:rPr/>
-            </w:pPr>
-            <w:r>
-              <w:rPr>
-                <w:rtl w:val="0"/>
-              </w:rPr>
-              <w:t xml:space="preserve">El sistema consulta base de datos</w:t>
+                <w:color w:val="0d0d0d"/>
+                <w:highlight w:val="white"/>
+                <w:rtl w:val="0"/>
+              </w:rPr>
+              <w:t xml:space="preserve">El usuario realiza una solicitud para consultar los pedidos registrados, con el fin de visualizar su información y estado dentro del sistema. </w:t>
+            </w:r>
+            <w:r>
+              <w:rPr>
+                <w:rtl w:val="0"/>
+              </w:rPr>
+            </w:r>
+          </w:p>
+        </w:tc>
+        <w:tc>
+          <w:tcPr>
+            <w:tcMar>
+              <w:top w:w="100.0" w:type="dxa"/>
+              <w:left w:w="100.0" w:type="dxa"/>
+              <w:bottom w:w="100.0" w:type="dxa"/>
+              <w:right w:w="100.0" w:type="dxa"/>
+            </w:tcMar>
+          </w:tcPr>
+          <w:p>
+            <w:pPr>
+              <w:widowControl w:val="0"/>
+              <w:spacing w:line="240" w:lineRule="auto"/>
+              <w:rPr/>
+            </w:pPr>
+            <w:r>
+              <w:rPr>
+                <w:color w:val="0d0d0d"/>
+                <w:highlight w:val="white"/>
+                <w:rtl w:val="0"/>
+              </w:rPr>
+              <w:t xml:space="preserve">El sistema realiza una consulta a la base de datos, recuperando la información necesaria para procesar la solicitud o mostrarla al usuario</w:t>
+            </w:r>
+            <w:r>
+              <w:rPr>
+                <w:rtl w:val="0"/>
+              </w:rPr>
             </w:r>
           </w:p>
         </w:tc>
@@ -18740,32 +18745,46 @@
             </w:pPr>
             <w:r>
               <w:rPr>
-                <w:rtl w:val="0"/>
-              </w:rPr>
-              <w:t xml:space="preserve">Visualiza lista</w:t>
-            </w:r>
-          </w:p>
-        </w:tc>
-        <w:tc>
-          <w:tcPr>
-            <w:tcMar>
-              <w:top w:w="100.0" w:type="dxa"/>
-              <w:left w:w="100.0" w:type="dxa"/>
-              <w:bottom w:w="100.0" w:type="dxa"/>
-              <w:right w:w="100.0" w:type="dxa"/>
-            </w:tcMar>
-          </w:tcPr>
-          <w:p>
-            <w:pPr>
-              <w:widowControl w:val="0"/>
-              <w:spacing w:line="240" w:lineRule="auto"/>
-              <w:rPr/>
-            </w:pPr>
-            <w:r>
-              <w:rPr>
-                <w:rtl w:val="0"/>
-              </w:rPr>
-              <w:t xml:space="preserve">El sistema muestra pedidos disponibles</w:t>
+                <w:color w:val="0d0d0d"/>
+                <w:highlight w:val="white"/>
+                <w:rtl w:val="0"/>
+              </w:rPr>
+              <w:t xml:space="preserve">El usuario accede a la lista de pedidos registrados en el sistema, permitiéndole visualizar la información general de cada uno.</w:t>
+            </w:r>
+            <w:r>
+              <w:rPr>
+                <w:rtl w:val="0"/>
+              </w:rPr>
+            </w:r>
+          </w:p>
+        </w:tc>
+        <w:tc>
+          <w:tcPr>
+            <w:tcMar>
+              <w:top w:w="100.0" w:type="dxa"/>
+              <w:left w:w="100.0" w:type="dxa"/>
+              <w:bottom w:w="100.0" w:type="dxa"/>
+              <w:right w:w="100.0" w:type="dxa"/>
+            </w:tcMar>
+          </w:tcPr>
+          <w:p>
+            <w:pPr>
+              <w:widowControl w:val="0"/>
+              <w:spacing w:line="240" w:lineRule="auto"/>
+              <w:rPr/>
+            </w:pPr>
+            <w:r>
+              <w:rPr>
+                <w:color w:val="0d0d0d"/>
+                <w:highlight w:val="white"/>
+                <w:rtl w:val="0"/>
+              </w:rPr>
+              <w:t xml:space="preserve">El sistema despliega la lista de pedidos disponibles, permitiendo al usuario visualizar la información registrada en el sistema</w:t>
+            </w:r>
+            <w:r>
+              <w:rPr>
+                <w:rtl w:val="0"/>
+              </w:rPr>
             </w:r>
           </w:p>
         </w:tc>
@@ -18968,9 +18987,16 @@
             </w:pPr>
             <w:r>
               <w:rPr>
-                <w:rtl w:val="0"/>
-              </w:rPr>
-              <w:t xml:space="preserve">Sin pedidos</w:t>
+                <w:color w:val="0d0d0d"/>
+                <w:highlight w:val="white"/>
+                <w:rtl w:val="0"/>
+              </w:rPr>
+              <w:t xml:space="preserve">Si el sistema detecta que no hay pedidos registrados en la base de datos, se mostrará una lista vacía y se notificará al usuario que no existen pedidos disponibles</w:t>
+            </w:r>
+            <w:r>
+              <w:rPr>
+                <w:rtl w:val="0"/>
+              </w:rPr>
             </w:r>
           </w:p>
         </w:tc>
@@ -19544,32 +19570,46 @@
             </w:pPr>
             <w:r>
               <w:rPr>
-                <w:rtl w:val="0"/>
-              </w:rPr>
-              <w:t xml:space="preserve">Estado actualizado</w:t>
-            </w:r>
-          </w:p>
-        </w:tc>
-        <w:tc>
-          <w:tcPr>
-            <w:tcMar>
-              <w:top w:w="100.0" w:type="dxa"/>
-              <w:left w:w="100.0" w:type="dxa"/>
-              <w:bottom w:w="100.0" w:type="dxa"/>
-              <w:right w:w="100.0" w:type="dxa"/>
-            </w:tcMar>
-          </w:tcPr>
-          <w:p>
-            <w:pPr>
-              <w:widowControl w:val="0"/>
-              <w:spacing w:line="240" w:lineRule="auto"/>
-              <w:rPr/>
-            </w:pPr>
-            <w:r>
-              <w:rPr>
-                <w:rtl w:val="0"/>
-              </w:rPr>
-              <w:t xml:space="preserve">Sistema genera notificación</w:t>
+                <w:color w:val="0d0d0d"/>
+                <w:highlight w:val="white"/>
+                <w:rtl w:val="0"/>
+              </w:rPr>
+              <w:t xml:space="preserve">El sistema confirma la actualización del estado del pedido, reflejando el cambio de manera correcta en la información almacenada.</w:t>
+            </w:r>
+            <w:r>
+              <w:rPr>
+                <w:rtl w:val="0"/>
+              </w:rPr>
+            </w:r>
+          </w:p>
+        </w:tc>
+        <w:tc>
+          <w:tcPr>
+            <w:tcMar>
+              <w:top w:w="100.0" w:type="dxa"/>
+              <w:left w:w="100.0" w:type="dxa"/>
+              <w:bottom w:w="100.0" w:type="dxa"/>
+              <w:right w:w="100.0" w:type="dxa"/>
+            </w:tcMar>
+          </w:tcPr>
+          <w:p>
+            <w:pPr>
+              <w:widowControl w:val="0"/>
+              <w:spacing w:line="240" w:lineRule="auto"/>
+              <w:rPr/>
+            </w:pPr>
+            <w:r>
+              <w:rPr>
+                <w:color w:val="0d0d0d"/>
+                <w:highlight w:val="white"/>
+                <w:rtl w:val="0"/>
+              </w:rPr>
+              <w:t xml:space="preserve">El sistema genera y envía una notificación al usuario, informando el resultado o estado del proceso realizado.</w:t>
+            </w:r>
+            <w:r>
+              <w:rPr>
+                <w:rtl w:val="0"/>
+              </w:rPr>
             </w:r>
           </w:p>
         </w:tc>
@@ -19620,31 +19660,46 @@
             </w:pPr>
             <w:r>
               <w:rPr>
-                <w:rtl w:val="0"/>
-              </w:rPr>
-            </w:r>
-          </w:p>
-        </w:tc>
-        <w:tc>
-          <w:tcPr>
-            <w:tcMar>
-              <w:top w:w="100.0" w:type="dxa"/>
-              <w:left w:w="100.0" w:type="dxa"/>
-              <w:bottom w:w="100.0" w:type="dxa"/>
-              <w:right w:w="100.0" w:type="dxa"/>
-            </w:tcMar>
-          </w:tcPr>
-          <w:p>
-            <w:pPr>
-              <w:widowControl w:val="0"/>
-              <w:spacing w:line="240" w:lineRule="auto"/>
-              <w:rPr/>
-            </w:pPr>
-            <w:r>
-              <w:rPr>
-                <w:rtl w:val="0"/>
-              </w:rPr>
-              <w:t xml:space="preserve">Cliente recibe aviso</w:t>
+                <w:color w:val="0d0d0d"/>
+                <w:highlight w:val="white"/>
+                <w:rtl w:val="0"/>
+              </w:rPr>
+              <w:t xml:space="preserve">El sistema actualiza el estado del envío a ‘Completado’, indicando que el proceso de entrega ha finalizado correctamente.</w:t>
+            </w:r>
+            <w:r>
+              <w:rPr>
+                <w:rtl w:val="0"/>
+              </w:rPr>
+            </w:r>
+          </w:p>
+        </w:tc>
+        <w:tc>
+          <w:tcPr>
+            <w:tcMar>
+              <w:top w:w="100.0" w:type="dxa"/>
+              <w:left w:w="100.0" w:type="dxa"/>
+              <w:bottom w:w="100.0" w:type="dxa"/>
+              <w:right w:w="100.0" w:type="dxa"/>
+            </w:tcMar>
+          </w:tcPr>
+          <w:p>
+            <w:pPr>
+              <w:widowControl w:val="0"/>
+              <w:spacing w:line="240" w:lineRule="auto"/>
+              <w:rPr/>
+            </w:pPr>
+            <w:r>
+              <w:rPr>
+                <w:color w:val="0d0d0d"/>
+                <w:highlight w:val="white"/>
+                <w:rtl w:val="0"/>
+              </w:rPr>
+              <w:t xml:space="preserve">El cliente recibe el aviso generado por el sistema, informándole sobre el estado o resultado del proceso realizado</w:t>
+            </w:r>
+            <w:r>
+              <w:rPr>
+                <w:rtl w:val="0"/>
+              </w:rPr>
             </w:r>
           </w:p>
         </w:tc>
@@ -19779,32 +19834,46 @@
             </w:pPr>
             <w:r>
               <w:rPr>
-                <w:rtl w:val="0"/>
-              </w:rPr>
-              <w:t xml:space="preserve">Error de envío</w:t>
-            </w:r>
-          </w:p>
-        </w:tc>
-        <w:tc>
-          <w:tcPr>
-            <w:tcMar>
-              <w:top w:w="100.0" w:type="dxa"/>
-              <w:left w:w="100.0" w:type="dxa"/>
-              <w:bottom w:w="100.0" w:type="dxa"/>
-              <w:right w:w="100.0" w:type="dxa"/>
-            </w:tcMar>
-          </w:tcPr>
-          <w:p>
-            <w:pPr>
-              <w:widowControl w:val="0"/>
-              <w:spacing w:line="240" w:lineRule="auto"/>
-              <w:rPr/>
-            </w:pPr>
-            <w:r>
-              <w:rPr>
-                <w:rtl w:val="0"/>
-              </w:rPr>
-              <w:t xml:space="preserve">Registra fallo en sistema</w:t>
+                <w:color w:val="0d0d0d"/>
+                <w:highlight w:val="white"/>
+                <w:rtl w:val="0"/>
+              </w:rPr>
+              <w:t xml:space="preserve">Si el sistema detecta un error durante el proceso de envío, se interrumpe la operación y se notifica al usuario que no fue posible completar la entrega.</w:t>
+            </w:r>
+            <w:r>
+              <w:rPr>
+                <w:rtl w:val="0"/>
+              </w:rPr>
+            </w:r>
+          </w:p>
+        </w:tc>
+        <w:tc>
+          <w:tcPr>
+            <w:tcMar>
+              <w:top w:w="100.0" w:type="dxa"/>
+              <w:left w:w="100.0" w:type="dxa"/>
+              <w:bottom w:w="100.0" w:type="dxa"/>
+              <w:right w:w="100.0" w:type="dxa"/>
+            </w:tcMar>
+          </w:tcPr>
+          <w:p>
+            <w:pPr>
+              <w:widowControl w:val="0"/>
+              <w:spacing w:line="240" w:lineRule="auto"/>
+              <w:rPr/>
+            </w:pPr>
+            <w:r>
+              <w:rPr>
+                <w:color w:val="0d0d0d"/>
+                <w:highlight w:val="white"/>
+                <w:rtl w:val="0"/>
+              </w:rPr>
+              <w:t xml:space="preserve">El sistema registra el error detectado, almacenando la información del fallo para su seguimiento y análisis posterior.</w:t>
+            </w:r>
+            <w:r>
+              <w:rPr>
+                <w:rtl w:val="0"/>
+              </w:rPr>
             </w:r>
           </w:p>
         </w:tc>
@@ -19943,12 +20012,12 @@
             <wp:extent cx="7709535" cy="3752850"/>
             <wp:effectExtent b="0" l="0" r="0" t="0"/>
             <wp:wrapNone/>
-            <wp:docPr id="14" name="image3.png"/>
+            <wp:docPr id="14" name="image1.png"/>
             <a:graphic>
               <a:graphicData uri="http://schemas.openxmlformats.org/drawingml/2006/picture">
                 <pic:pic>
                   <pic:nvPicPr>
-                    <pic:cNvPr id="0" name="image3.png"/>
+                    <pic:cNvPr id="0" name="image1.png"/>
                     <pic:cNvPicPr preferRelativeResize="0"/>
                   </pic:nvPicPr>
                   <pic:blipFill>
@@ -20508,9 +20577,16 @@
             </w:pPr>
             <w:r>
               <w:rPr>
-                <w:rtl w:val="0"/>
-              </w:rPr>
-              <w:t xml:space="preserve">Selecciona pedido</w:t>
+                <w:color w:val="0d0d0d"/>
+                <w:highlight w:val="white"/>
+                <w:rtl w:val="0"/>
+              </w:rPr>
+              <w:t xml:space="preserve">“El usuario selecciona un pedido de la lista disponible, con el fin de visualizar su información o realizar acciones sobre él.</w:t>
+            </w:r>
+            <w:r>
+              <w:rPr>
+                <w:rtl w:val="0"/>
+              </w:rPr>
             </w:r>
           </w:p>
         </w:tc>
@@ -20532,9 +20608,16 @@
             </w:pPr>
             <w:r>
               <w:rPr>
-                <w:rtl w:val="0"/>
-              </w:rPr>
-              <w:t xml:space="preserve">Muestra detalles del pedido</w:t>
+                <w:color w:val="0d0d0d"/>
+                <w:highlight w:val="white"/>
+                <w:rtl w:val="0"/>
+              </w:rPr>
+              <w:t xml:space="preserve">El sistema despliega la información detallada del pedido seleccionado, permitiendo al usuario visualizar sus características, estado y datos asociados.”</w:t>
+            </w:r>
+            <w:r>
+              <w:rPr>
+                <w:rtl w:val="0"/>
+              </w:rPr>
             </w:r>
           </w:p>
         </w:tc>
@@ -20621,32 +20704,46 @@
             </w:pPr>
             <w:r>
               <w:rPr>
-                <w:rtl w:val="0"/>
-              </w:rPr>
-              <w:t xml:space="preserve">Solicita generar recibo</w:t>
-            </w:r>
-          </w:p>
-        </w:tc>
-        <w:tc>
-          <w:tcPr>
-            <w:tcMar>
-              <w:top w:w="100.0" w:type="dxa"/>
-              <w:left w:w="100.0" w:type="dxa"/>
-              <w:bottom w:w="100.0" w:type="dxa"/>
-              <w:right w:w="100.0" w:type="dxa"/>
-            </w:tcMar>
-          </w:tcPr>
-          <w:p>
-            <w:pPr>
-              <w:widowControl w:val="0"/>
-              <w:spacing w:line="240" w:lineRule="auto"/>
-              <w:rPr/>
-            </w:pPr>
-            <w:r>
-              <w:rPr>
-                <w:rtl w:val="0"/>
-              </w:rPr>
-              <w:t xml:space="preserve">Calcula total y genera comprobante</w:t>
+                <w:color w:val="0d0d0d"/>
+                <w:highlight w:val="white"/>
+                <w:rtl w:val="0"/>
+              </w:rPr>
+              <w:t xml:space="preserve">El usuario solicita la generación del recibo correspondiente al pedido, con el fin de obtener el comprobante de la transacción realizada.</w:t>
+            </w:r>
+            <w:r>
+              <w:rPr>
+                <w:rtl w:val="0"/>
+              </w:rPr>
+            </w:r>
+          </w:p>
+        </w:tc>
+        <w:tc>
+          <w:tcPr>
+            <w:tcMar>
+              <w:top w:w="100.0" w:type="dxa"/>
+              <w:left w:w="100.0" w:type="dxa"/>
+              <w:bottom w:w="100.0" w:type="dxa"/>
+              <w:right w:w="100.0" w:type="dxa"/>
+            </w:tcMar>
+          </w:tcPr>
+          <w:p>
+            <w:pPr>
+              <w:widowControl w:val="0"/>
+              <w:spacing w:line="240" w:lineRule="auto"/>
+              <w:rPr/>
+            </w:pPr>
+            <w:r>
+              <w:rPr>
+                <w:color w:val="0d0d0d"/>
+                <w:highlight w:val="white"/>
+                <w:rtl w:val="0"/>
+              </w:rPr>
+              <w:t xml:space="preserve">El sistema realiza el cálculo del total del pedido y genera el comprobante correspondiente, reflejando la información de la transacción realizada.”</w:t>
+            </w:r>
+            <w:r>
+              <w:rPr>
+                <w:rtl w:val="0"/>
+              </w:rPr>
             </w:r>
           </w:p>
         </w:tc>
@@ -20733,32 +20830,46 @@
             </w:pPr>
             <w:r>
               <w:rPr>
-                <w:rtl w:val="0"/>
-              </w:rPr>
-              <w:t xml:space="preserve">Confirma operación</w:t>
-            </w:r>
-          </w:p>
-        </w:tc>
-        <w:tc>
-          <w:tcPr>
-            <w:tcMar>
-              <w:top w:w="100.0" w:type="dxa"/>
-              <w:left w:w="100.0" w:type="dxa"/>
-              <w:bottom w:w="100.0" w:type="dxa"/>
-              <w:right w:w="100.0" w:type="dxa"/>
-            </w:tcMar>
-          </w:tcPr>
-          <w:p>
-            <w:pPr>
-              <w:widowControl w:val="0"/>
-              <w:spacing w:line="240" w:lineRule="auto"/>
-              <w:rPr/>
-            </w:pPr>
-            <w:r>
-              <w:rPr>
-                <w:rtl w:val="0"/>
-              </w:rPr>
-              <w:t xml:space="preserve">Guarda recibo en el sistema</w:t>
+                <w:color w:val="0d0d0d"/>
+                <w:highlight w:val="white"/>
+                <w:rtl w:val="0"/>
+              </w:rPr>
+              <w:t xml:space="preserve">El usuario confirma la operación solicitada, autorizando al sistema a ejecutar el proceso correspondiente.</w:t>
+            </w:r>
+            <w:r>
+              <w:rPr>
+                <w:rtl w:val="0"/>
+              </w:rPr>
+            </w:r>
+          </w:p>
+        </w:tc>
+        <w:tc>
+          <w:tcPr>
+            <w:tcMar>
+              <w:top w:w="100.0" w:type="dxa"/>
+              <w:left w:w="100.0" w:type="dxa"/>
+              <w:bottom w:w="100.0" w:type="dxa"/>
+              <w:right w:w="100.0" w:type="dxa"/>
+            </w:tcMar>
+          </w:tcPr>
+          <w:p>
+            <w:pPr>
+              <w:widowControl w:val="0"/>
+              <w:spacing w:line="240" w:lineRule="auto"/>
+              <w:rPr/>
+            </w:pPr>
+            <w:r>
+              <w:rPr>
+                <w:color w:val="0d0d0d"/>
+                <w:highlight w:val="white"/>
+                <w:rtl w:val="0"/>
+              </w:rPr>
+              <w:t xml:space="preserve">El sistema almacena el recibo generado en la base de datos, asegurando su disponibilidad para consultas futuras.”</w:t>
+            </w:r>
+            <w:r>
+              <w:rPr>
+                <w:rtl w:val="0"/>
+              </w:rPr>
             </w:r>
           </w:p>
         </w:tc>
@@ -20961,32 +21072,46 @@
             </w:pPr>
             <w:r>
               <w:rPr>
-                <w:rtl w:val="0"/>
-              </w:rPr>
-              <w:t xml:space="preserve">Pedido no encontrado</w:t>
-            </w:r>
-          </w:p>
-        </w:tc>
-        <w:tc>
-          <w:tcPr>
-            <w:tcMar>
-              <w:top w:w="100.0" w:type="dxa"/>
-              <w:left w:w="100.0" w:type="dxa"/>
-              <w:bottom w:w="100.0" w:type="dxa"/>
-              <w:right w:w="100.0" w:type="dxa"/>
-            </w:tcMar>
-          </w:tcPr>
-          <w:p>
-            <w:pPr>
-              <w:widowControl w:val="0"/>
-              <w:spacing w:line="240" w:lineRule="auto"/>
-              <w:rPr/>
-            </w:pPr>
-            <w:r>
-              <w:rPr>
-                <w:rtl w:val="0"/>
-              </w:rPr>
-              <w:t xml:space="preserve">Muestra mensaje de error</w:t>
+                <w:color w:val="0d0d0d"/>
+                <w:highlight w:val="white"/>
+                <w:rtl w:val="0"/>
+              </w:rPr>
+              <w:t xml:space="preserve">Si el sistema no encuentra el pedido solicitado, se detiene el proceso y se notifica al usuario que el pedido no existe o no está disponible.”</w:t>
+            </w:r>
+            <w:r>
+              <w:rPr>
+                <w:rtl w:val="0"/>
+              </w:rPr>
+            </w:r>
+          </w:p>
+        </w:tc>
+        <w:tc>
+          <w:tcPr>
+            <w:tcMar>
+              <w:top w:w="100.0" w:type="dxa"/>
+              <w:left w:w="100.0" w:type="dxa"/>
+              <w:bottom w:w="100.0" w:type="dxa"/>
+              <w:right w:w="100.0" w:type="dxa"/>
+            </w:tcMar>
+          </w:tcPr>
+          <w:p>
+            <w:pPr>
+              <w:widowControl w:val="0"/>
+              <w:spacing w:line="240" w:lineRule="auto"/>
+              <w:rPr/>
+            </w:pPr>
+            <w:r>
+              <w:rPr>
+                <w:color w:val="0d0d0d"/>
+                <w:highlight w:val="white"/>
+                <w:rtl w:val="0"/>
+              </w:rPr>
+              <w:t xml:space="preserve">El sistema despliega un mensaje de error indicando que ocurrió un problema durante el proceso, impidiendo completar la operación solicitada.</w:t>
+            </w:r>
+            <w:r>
+              <w:rPr>
+                <w:rtl w:val="0"/>
+              </w:rPr>
             </w:r>
           </w:p>
         </w:tc>
@@ -21072,32 +21197,46 @@
             </w:pPr>
             <w:r>
               <w:rPr>
-                <w:rtl w:val="0"/>
-              </w:rPr>
-              <w:t xml:space="preserve">Error en cálculo</w:t>
-            </w:r>
-          </w:p>
-        </w:tc>
-        <w:tc>
-          <w:tcPr>
-            <w:tcMar>
-              <w:top w:w="100.0" w:type="dxa"/>
-              <w:left w:w="100.0" w:type="dxa"/>
-              <w:bottom w:w="100.0" w:type="dxa"/>
-              <w:right w:w="100.0" w:type="dxa"/>
-            </w:tcMar>
-          </w:tcPr>
-          <w:p>
-            <w:pPr>
-              <w:widowControl w:val="0"/>
-              <w:spacing w:line="240" w:lineRule="auto"/>
-              <w:rPr/>
-            </w:pPr>
-            <w:r>
-              <w:rPr>
-                <w:rtl w:val="0"/>
-              </w:rPr>
-              <w:t xml:space="preserve">Notifica fallo y no genera recibo</w:t>
+                <w:color w:val="0d0d0d"/>
+                <w:highlight w:val="white"/>
+                <w:rtl w:val="0"/>
+              </w:rPr>
+              <w:t xml:space="preserve">Si el sistema detecta un error durante el cálculo, se interrumpe el proceso y se notifica al usuario que no fue posible completar la operación.”</w:t>
+            </w:r>
+            <w:r>
+              <w:rPr>
+                <w:rtl w:val="0"/>
+              </w:rPr>
+            </w:r>
+          </w:p>
+        </w:tc>
+        <w:tc>
+          <w:tcPr>
+            <w:tcMar>
+              <w:top w:w="100.0" w:type="dxa"/>
+              <w:left w:w="100.0" w:type="dxa"/>
+              <w:bottom w:w="100.0" w:type="dxa"/>
+              <w:right w:w="100.0" w:type="dxa"/>
+            </w:tcMar>
+          </w:tcPr>
+          <w:p>
+            <w:pPr>
+              <w:widowControl w:val="0"/>
+              <w:spacing w:line="240" w:lineRule="auto"/>
+              <w:rPr/>
+            </w:pPr>
+            <w:r>
+              <w:rPr>
+                <w:color w:val="0d0d0d"/>
+                <w:highlight w:val="white"/>
+                <w:rtl w:val="0"/>
+              </w:rPr>
+              <w:t xml:space="preserve">El sistema detecta el fallo, notifica al usuario sobre el error ocurrido y evita la generación del recibo debido a la inconsistencia en el proceso.</w:t>
+            </w:r>
+            <w:r>
+              <w:rPr>
+                <w:rtl w:val="0"/>
+              </w:rPr>
             </w:r>
           </w:p>
         </w:tc>
@@ -23035,32 +23174,46 @@
             </w:pPr>
             <w:r>
               <w:rPr>
-                <w:rtl w:val="0"/>
-              </w:rPr>
-              <w:t xml:space="preserve">Solicita reporte semanal</w:t>
-            </w:r>
-          </w:p>
-        </w:tc>
-        <w:tc>
-          <w:tcPr>
-            <w:tcMar>
-              <w:top w:w="100.0" w:type="dxa"/>
-              <w:left w:w="100.0" w:type="dxa"/>
-              <w:bottom w:w="100.0" w:type="dxa"/>
-              <w:right w:w="100.0" w:type="dxa"/>
-            </w:tcMar>
-          </w:tcPr>
-          <w:p>
-            <w:pPr>
-              <w:widowControl w:val="0"/>
-              <w:spacing w:line="240" w:lineRule="auto"/>
-              <w:rPr/>
-            </w:pPr>
-            <w:r>
-              <w:rPr>
-                <w:rtl w:val="0"/>
-              </w:rPr>
-              <w:t xml:space="preserve">Consulta base de datos</w:t>
+                <w:color w:val="0d0d0d"/>
+                <w:highlight w:val="white"/>
+                <w:rtl w:val="0"/>
+              </w:rPr>
+              <w:t xml:space="preserve">El usuario solicita la generación del reporte semanal, indicando su intención de obtener información consolidada del período correspondiente</w:t>
+            </w:r>
+            <w:r>
+              <w:rPr>
+                <w:rtl w:val="0"/>
+              </w:rPr>
+            </w:r>
+          </w:p>
+        </w:tc>
+        <w:tc>
+          <w:tcPr>
+            <w:tcMar>
+              <w:top w:w="100.0" w:type="dxa"/>
+              <w:left w:w="100.0" w:type="dxa"/>
+              <w:bottom w:w="100.0" w:type="dxa"/>
+              <w:right w:w="100.0" w:type="dxa"/>
+            </w:tcMar>
+          </w:tcPr>
+          <w:p>
+            <w:pPr>
+              <w:widowControl w:val="0"/>
+              <w:spacing w:line="240" w:lineRule="auto"/>
+              <w:rPr/>
+            </w:pPr>
+            <w:r>
+              <w:rPr>
+                <w:color w:val="0d0d0d"/>
+                <w:highlight w:val="white"/>
+                <w:rtl w:val="0"/>
+              </w:rPr>
+              <w:t xml:space="preserve">El sistema realiza una consulta a la base de datos, recuperando la información necesaria para generar el reporte solicitado.</w:t>
+            </w:r>
+            <w:r>
+              <w:rPr>
+                <w:rtl w:val="0"/>
+              </w:rPr>
             </w:r>
           </w:p>
         </w:tc>
@@ -23142,36 +23295,55 @@
           <w:p>
             <w:pPr>
               <w:widowControl w:val="0"/>
-              <w:spacing w:line="240" w:lineRule="auto"/>
-              <w:rPr/>
-            </w:pPr>
-            <w:r>
-              <w:rPr>
-                <w:rtl w:val="0"/>
-              </w:rPr>
-            </w:r>
-          </w:p>
-        </w:tc>
-        <w:tc>
-          <w:tcPr>
-            <w:tcMar>
-              <w:top w:w="100.0" w:type="dxa"/>
-              <w:left w:w="100.0" w:type="dxa"/>
-              <w:bottom w:w="100.0" w:type="dxa"/>
-              <w:right w:w="100.0" w:type="dxa"/>
-            </w:tcMar>
-          </w:tcPr>
-          <w:p>
-            <w:pPr>
-              <w:widowControl w:val="0"/>
-              <w:spacing w:line="240" w:lineRule="auto"/>
-              <w:rPr/>
-            </w:pPr>
-            <w:r>
-              <w:rPr>
-                <w:rtl w:val="0"/>
-              </w:rPr>
-              <w:t xml:space="preserve">Consolida información</w:t>
+              <w:pBdr>
+                <w:top w:color="auto" w:space="0" w:sz="0" w:val="none"/>
+                <w:bottom w:color="auto" w:space="0" w:sz="0" w:val="none"/>
+                <w:right w:color="auto" w:space="0" w:sz="0" w:val="none"/>
+                <w:between w:color="auto" w:space="0" w:sz="0" w:val="none"/>
+              </w:pBdr>
+              <w:shd w:fill="ffffff" w:val="clear"/>
+              <w:spacing w:after="120" w:before="120" w:line="240" w:lineRule="auto"/>
+              <w:ind w:left="720" w:firstLine="0"/>
+              <w:rPr>
+                <w:color w:val="0d0d0d"/>
+              </w:rPr>
+            </w:pPr>
+            <w:r>
+              <w:rPr>
+                <w:color w:val="0d0d0d"/>
+                <w:rtl w:val="0"/>
+              </w:rPr>
+              <w:t xml:space="preserve">El sistema solicita los parámetros del reporte (fechas, filtros, etc.)</w:t>
+            </w:r>
+          </w:p>
+        </w:tc>
+        <w:tc>
+          <w:tcPr>
+            <w:tcMar>
+              <w:top w:w="100.0" w:type="dxa"/>
+              <w:left w:w="100.0" w:type="dxa"/>
+              <w:bottom w:w="100.0" w:type="dxa"/>
+              <w:right w:w="100.0" w:type="dxa"/>
+            </w:tcMar>
+          </w:tcPr>
+          <w:p>
+            <w:pPr>
+              <w:widowControl w:val="0"/>
+              <w:spacing w:line="240" w:lineRule="auto"/>
+              <w:rPr/>
+            </w:pPr>
+            <w:r>
+              <w:rPr>
+                <w:color w:val="0d0d0d"/>
+                <w:highlight w:val="white"/>
+                <w:rtl w:val="0"/>
+              </w:rPr>
+              <w:t xml:space="preserve">El sistema organiza y consolida la información recopilada, preparándola para la generación del reporte correspondiente.</w:t>
+            </w:r>
+            <w:r>
+              <w:rPr>
+                <w:rtl w:val="0"/>
+              </w:rPr>
             </w:r>
           </w:p>
         </w:tc>
@@ -23258,31 +23430,46 @@
             </w:pPr>
             <w:r>
               <w:rPr>
-                <w:rtl w:val="0"/>
-              </w:rPr>
-            </w:r>
-          </w:p>
-        </w:tc>
-        <w:tc>
-          <w:tcPr>
-            <w:tcMar>
-              <w:top w:w="100.0" w:type="dxa"/>
-              <w:left w:w="100.0" w:type="dxa"/>
-              <w:bottom w:w="100.0" w:type="dxa"/>
-              <w:right w:w="100.0" w:type="dxa"/>
-            </w:tcMar>
-          </w:tcPr>
-          <w:p>
-            <w:pPr>
-              <w:widowControl w:val="0"/>
-              <w:spacing w:line="240" w:lineRule="auto"/>
-              <w:rPr/>
-            </w:pPr>
-            <w:r>
-              <w:rPr>
-                <w:rtl w:val="0"/>
-              </w:rPr>
-              <w:t xml:space="preserve">Genera reporte en pantalla o descarga</w:t>
+                <w:color w:val="0d0d0d"/>
+                <w:highlight w:val="white"/>
+                <w:rtl w:val="0"/>
+              </w:rPr>
+              <w:t xml:space="preserve">El usuario confirma la acción solicitada, autorizando al sistema a continuar con el proceso correspondiente</w:t>
+            </w:r>
+            <w:r>
+              <w:rPr>
+                <w:rtl w:val="0"/>
+              </w:rPr>
+            </w:r>
+          </w:p>
+        </w:tc>
+        <w:tc>
+          <w:tcPr>
+            <w:tcMar>
+              <w:top w:w="100.0" w:type="dxa"/>
+              <w:left w:w="100.0" w:type="dxa"/>
+              <w:bottom w:w="100.0" w:type="dxa"/>
+              <w:right w:w="100.0" w:type="dxa"/>
+            </w:tcMar>
+          </w:tcPr>
+          <w:p>
+            <w:pPr>
+              <w:widowControl w:val="0"/>
+              <w:spacing w:line="240" w:lineRule="auto"/>
+              <w:rPr/>
+            </w:pPr>
+            <w:r>
+              <w:rPr>
+                <w:color w:val="0d0d0d"/>
+                <w:highlight w:val="white"/>
+                <w:rtl w:val="0"/>
+              </w:rPr>
+              <w:t xml:space="preserve">El sistema genera el reporte semanal y lo presenta en pantalla, brindando además la opción de descargarlo en un formato adecuado para su uso posterior.</w:t>
+            </w:r>
+            <w:r>
+              <w:rPr>
+                <w:rtl w:val="0"/>
+              </w:rPr>
             </w:r>
           </w:p>
         </w:tc>
@@ -23485,9 +23672,16 @@
             </w:pPr>
             <w:r>
               <w:rPr>
-                <w:rtl w:val="0"/>
-              </w:rPr>
-              <w:t xml:space="preserve">Sin registros en el periodo</w:t>
+                <w:color w:val="0d0d0d"/>
+                <w:highlight w:val="white"/>
+                <w:rtl w:val="0"/>
+              </w:rPr>
+              <w:t xml:space="preserve">Si el sistema detecta que no hay registros dentro del período seleccionado, se generará un reporte vacío y se notificará al usuario que no existen datos disponibles.</w:t>
+            </w:r>
+            <w:r>
+              <w:rPr>
+                <w:rtl w:val="0"/>
+              </w:rPr>
             </w:r>
           </w:p>
         </w:tc>
@@ -24241,32 +24435,46 @@
             </w:pPr>
             <w:r>
               <w:rPr>
-                <w:rtl w:val="0"/>
-              </w:rPr>
-              <w:t xml:space="preserve">Solicita reporte mensual</w:t>
-            </w:r>
-          </w:p>
-        </w:tc>
-        <w:tc>
-          <w:tcPr>
-            <w:tcMar>
-              <w:top w:w="100.0" w:type="dxa"/>
-              <w:left w:w="100.0" w:type="dxa"/>
-              <w:bottom w:w="100.0" w:type="dxa"/>
-              <w:right w:w="100.0" w:type="dxa"/>
-            </w:tcMar>
-          </w:tcPr>
-          <w:p>
-            <w:pPr>
-              <w:widowControl w:val="0"/>
-              <w:spacing w:line="240" w:lineRule="auto"/>
-              <w:rPr/>
-            </w:pPr>
-            <w:r>
-              <w:rPr>
-                <w:rtl w:val="0"/>
-              </w:rPr>
-              <w:t xml:space="preserve">Consulta información del mes</w:t>
+                <w:color w:val="0d0d0d"/>
+                <w:highlight w:val="white"/>
+                <w:rtl w:val="0"/>
+              </w:rPr>
+              <w:t xml:space="preserve">El usuario solicita la generación del reporte mensual, con el fin de obtener información consolidada del período correspondiente.</w:t>
+            </w:r>
+            <w:r>
+              <w:rPr>
+                <w:rtl w:val="0"/>
+              </w:rPr>
+            </w:r>
+          </w:p>
+        </w:tc>
+        <w:tc>
+          <w:tcPr>
+            <w:tcMar>
+              <w:top w:w="100.0" w:type="dxa"/>
+              <w:left w:w="100.0" w:type="dxa"/>
+              <w:bottom w:w="100.0" w:type="dxa"/>
+              <w:right w:w="100.0" w:type="dxa"/>
+            </w:tcMar>
+          </w:tcPr>
+          <w:p>
+            <w:pPr>
+              <w:widowControl w:val="0"/>
+              <w:spacing w:line="240" w:lineRule="auto"/>
+              <w:rPr/>
+            </w:pPr>
+            <w:r>
+              <w:rPr>
+                <w:color w:val="0d0d0d"/>
+                <w:highlight w:val="white"/>
+                <w:rtl w:val="0"/>
+              </w:rPr>
+              <w:t xml:space="preserve">El usuario solicita la consulta de la información del mes seleccionado, con el fin de analizar los datos registrados durante ese período</w:t>
+            </w:r>
+            <w:r>
+              <w:rPr>
+                <w:rtl w:val="0"/>
+              </w:rPr>
             </w:r>
           </w:p>
         </w:tc>
@@ -24353,31 +24561,58 @@
             </w:pPr>
             <w:r>
               <w:rPr>
-                <w:rtl w:val="0"/>
-              </w:rPr>
-            </w:r>
-          </w:p>
-        </w:tc>
-        <w:tc>
-          <w:tcPr>
-            <w:tcMar>
-              <w:top w:w="100.0" w:type="dxa"/>
-              <w:left w:w="100.0" w:type="dxa"/>
-              <w:bottom w:w="100.0" w:type="dxa"/>
-              <w:right w:w="100.0" w:type="dxa"/>
-            </w:tcMar>
-          </w:tcPr>
-          <w:p>
-            <w:pPr>
-              <w:widowControl w:val="0"/>
-              <w:spacing w:line="240" w:lineRule="auto"/>
-              <w:rPr/>
-            </w:pPr>
-            <w:r>
-              <w:rPr>
-                <w:rtl w:val="0"/>
-              </w:rPr>
-              <w:t xml:space="preserve">Calcula totales y métricas</w:t>
+                <w:color w:val="0d0d0d"/>
+                <w:highlight w:val="white"/>
+                <w:rtl w:val="0"/>
+              </w:rPr>
+              <w:t xml:space="preserve">El usuario solicita el cálculo del total de sus pedidos registrados, con el fin de conocer el valor acumulado de sus transacciones.</w:t>
+            </w:r>
+            <w:r>
+              <w:rPr>
+                <w:rtl w:val="0"/>
+              </w:rPr>
+            </w:r>
+          </w:p>
+          <w:p>
+            <w:pPr>
+              <w:widowControl w:val="0"/>
+              <w:spacing w:line="240" w:lineRule="auto"/>
+              <w:rPr/>
+            </w:pPr>
+            <w:r>
+              <w:rPr>
+                <w:rtl w:val="0"/>
+              </w:rPr>
+            </w:r>
+          </w:p>
+        </w:tc>
+        <w:tc>
+          <w:tcPr>
+            <w:tcMar>
+              <w:top w:w="100.0" w:type="dxa"/>
+              <w:left w:w="100.0" w:type="dxa"/>
+              <w:bottom w:w="100.0" w:type="dxa"/>
+              <w:right w:w="100.0" w:type="dxa"/>
+            </w:tcMar>
+          </w:tcPr>
+          <w:p>
+            <w:pPr>
+              <w:widowControl w:val="0"/>
+              <w:spacing w:line="240" w:lineRule="auto"/>
+              <w:rPr/>
+            </w:pPr>
+            <w:r>
+              <w:rPr>
+                <w:color w:val="0d0d0d"/>
+                <w:highlight w:val="white"/>
+                <w:rtl w:val="0"/>
+              </w:rPr>
+              <w:t xml:space="preserve">El sistema realiza el cálculo de los totales y métricas del período seleccionado, generando información relevante para el análisis de los datos.</w:t>
+            </w:r>
+            <w:r>
+              <w:rPr>
+                <w:rtl w:val="0"/>
+              </w:rPr>
             </w:r>
           </w:p>
         </w:tc>
@@ -24464,6 +24699,14 @@
             </w:pPr>
             <w:r>
               <w:rPr>
+                <w:color w:val="0d0d0d"/>
+                <w:highlight w:val="white"/>
+                <w:rtl w:val="0"/>
+              </w:rPr>
+              <w:t xml:space="preserve">“El usuario solicita la generación o visualización del recibo correspondiente a sus transacciones.”</w:t>
+            </w:r>
+            <w:r>
+              <w:rPr>
                 <w:rtl w:val="0"/>
               </w:rPr>
             </w:r>
@@ -24691,32 +24934,46 @@
             </w:pPr>
             <w:r>
               <w:rPr>
-                <w:rtl w:val="0"/>
-              </w:rPr>
-              <w:t xml:space="preserve">Sin pedidos registrados</w:t>
-            </w:r>
-          </w:p>
-        </w:tc>
-        <w:tc>
-          <w:tcPr>
-            <w:tcMar>
-              <w:top w:w="100.0" w:type="dxa"/>
-              <w:left w:w="100.0" w:type="dxa"/>
-              <w:bottom w:w="100.0" w:type="dxa"/>
-              <w:right w:w="100.0" w:type="dxa"/>
-            </w:tcMar>
-          </w:tcPr>
-          <w:p>
-            <w:pPr>
-              <w:widowControl w:val="0"/>
-              <w:spacing w:line="240" w:lineRule="auto"/>
-              <w:rPr/>
-            </w:pPr>
-            <w:r>
-              <w:rPr>
-                <w:rtl w:val="0"/>
-              </w:rPr>
-              <w:t xml:space="preserve">Muestra notificación</w:t>
+                <w:color w:val="0d0d0d"/>
+                <w:highlight w:val="white"/>
+                <w:rtl w:val="0"/>
+              </w:rPr>
+              <w:t xml:space="preserve">Si el sistema detecta que no hay pedidos registrados, se detiene el proceso y se notifica al usuario que no existen datos disponibles para realizar la operación.</w:t>
+            </w:r>
+            <w:r>
+              <w:rPr>
+                <w:rtl w:val="0"/>
+              </w:rPr>
+            </w:r>
+          </w:p>
+        </w:tc>
+        <w:tc>
+          <w:tcPr>
+            <w:tcMar>
+              <w:top w:w="100.0" w:type="dxa"/>
+              <w:left w:w="100.0" w:type="dxa"/>
+              <w:bottom w:w="100.0" w:type="dxa"/>
+              <w:right w:w="100.0" w:type="dxa"/>
+            </w:tcMar>
+          </w:tcPr>
+          <w:p>
+            <w:pPr>
+              <w:widowControl w:val="0"/>
+              <w:spacing w:line="240" w:lineRule="auto"/>
+              <w:rPr/>
+            </w:pPr>
+            <w:r>
+              <w:rPr>
+                <w:color w:val="0d0d0d"/>
+                <w:highlight w:val="white"/>
+                <w:rtl w:val="0"/>
+              </w:rPr>
+              <w:t xml:space="preserve">El sistema despliega una notificación informando al usuario sobre el resultado o estado de la operación realizada.”</w:t>
+            </w:r>
+            <w:r>
+              <w:rPr>
+                <w:rtl w:val="0"/>
+              </w:rPr>
             </w:r>
           </w:p>
         </w:tc>
@@ -24989,18 +25246,18 @@
       </w:r>
       <w:r>
         <w:drawing>
-          <wp:anchor allowOverlap="1" behindDoc="1" distB="114300" distT="114300" distL="114300" distR="114300" hidden="0" layoutInCell="1" locked="0" relativeHeight="0" simplePos="0">
+          <wp:anchor allowOverlap="1" behindDoc="0" distB="114300" distT="114300" distL="114300" distR="114300" hidden="0" layoutInCell="1" locked="0" relativeHeight="0" simplePos="0">
             <wp:simplePos x="0" y="0"/>
             <wp:positionH relativeFrom="column">
-              <wp:posOffset>-847724</wp:posOffset>
+              <wp:posOffset>-581024</wp:posOffset>
             </wp:positionH>
             <wp:positionV relativeFrom="paragraph">
-              <wp:posOffset>281442</wp:posOffset>
+              <wp:posOffset>361950</wp:posOffset>
             </wp:positionV>
-            <wp:extent cx="7268528" cy="3995283"/>
+            <wp:extent cx="6902479" cy="3972734"/>
             <wp:effectExtent b="0" l="0" r="0" t="0"/>
             <wp:wrapNone/>
-            <wp:docPr id="15" name="image5.png"/>
+            <wp:docPr id="13" name="image5.png"/>
             <a:graphic>
               <a:graphicData uri="http://schemas.openxmlformats.org/drawingml/2006/picture">
                 <pic:pic>
@@ -25010,7 +25267,7 @@
                   </pic:nvPicPr>
                   <pic:blipFill>
                     <a:blip r:embed="rId11"/>
-                    <a:srcRect b="-1988" l="-2129" r="-3875" t="0"/>
+                    <a:srcRect b="0" l="0" r="0" t="0"/>
                     <a:stretch>
                       <a:fillRect/>
                     </a:stretch>
@@ -25018,7 +25275,7 @@
                   <pic:spPr>
                     <a:xfrm>
                       <a:off x="0" y="0"/>
-                      <a:ext cx="7268528" cy="3995283"/>
+                      <a:ext cx="6902479" cy="3972734"/>
                     </a:xfrm>
                     <a:prstGeom prst="rect"/>
                     <a:ln/>
@@ -25748,32 +26005,46 @@
             </w:pPr>
             <w:r>
               <w:rPr>
-                <w:rtl w:val="0"/>
-              </w:rPr>
-              <w:t xml:space="preserve">Solicita pedidos</w:t>
-            </w:r>
-          </w:p>
-        </w:tc>
-        <w:tc>
-          <w:tcPr>
-            <w:tcMar>
-              <w:top w:w="100.0" w:type="dxa"/>
-              <w:left w:w="100.0" w:type="dxa"/>
-              <w:bottom w:w="100.0" w:type="dxa"/>
-              <w:right w:w="100.0" w:type="dxa"/>
-            </w:tcMar>
-          </w:tcPr>
-          <w:p>
-            <w:pPr>
-              <w:widowControl w:val="0"/>
-              <w:spacing w:line="240" w:lineRule="auto"/>
-              <w:rPr/>
-            </w:pPr>
-            <w:r>
-              <w:rPr>
-                <w:rtl w:val="0"/>
-              </w:rPr>
-              <w:t xml:space="preserve">El sistema consulta pedidos pendientes</w:t>
+                <w:color w:val="0d0d0d"/>
+                <w:highlight w:val="white"/>
+                <w:rtl w:val="0"/>
+              </w:rPr>
+              <w:t xml:space="preserve">El usuario solicita la consulta de los pedidos registrados en el sistema, con el fin de visualizar su información y estado.</w:t>
+            </w:r>
+            <w:r>
+              <w:rPr>
+                <w:rtl w:val="0"/>
+              </w:rPr>
+            </w:r>
+          </w:p>
+        </w:tc>
+        <w:tc>
+          <w:tcPr>
+            <w:tcMar>
+              <w:top w:w="100.0" w:type="dxa"/>
+              <w:left w:w="100.0" w:type="dxa"/>
+              <w:bottom w:w="100.0" w:type="dxa"/>
+              <w:right w:w="100.0" w:type="dxa"/>
+            </w:tcMar>
+          </w:tcPr>
+          <w:p>
+            <w:pPr>
+              <w:widowControl w:val="0"/>
+              <w:spacing w:line="240" w:lineRule="auto"/>
+              <w:rPr/>
+            </w:pPr>
+            <w:r>
+              <w:rPr>
+                <w:color w:val="0d0d0d"/>
+                <w:highlight w:val="white"/>
+                <w:rtl w:val="0"/>
+              </w:rPr>
+              <w:t xml:space="preserve">El sistema realiza una consulta para obtener los pedidos que se encuentran en estado pendiente, con el fin de procesarlos o mostrarlos al usuario.</w:t>
+            </w:r>
+            <w:r>
+              <w:rPr>
+                <w:rtl w:val="0"/>
+              </w:rPr>
             </w:r>
           </w:p>
         </w:tc>
@@ -25860,32 +26131,46 @@
             </w:pPr>
             <w:r>
               <w:rPr>
-                <w:rtl w:val="0"/>
-              </w:rPr>
-              <w:t xml:space="preserve">Muestra lista</w:t>
-            </w:r>
-          </w:p>
-        </w:tc>
-        <w:tc>
-          <w:tcPr>
-            <w:tcMar>
-              <w:top w:w="100.0" w:type="dxa"/>
-              <w:left w:w="100.0" w:type="dxa"/>
-              <w:bottom w:w="100.0" w:type="dxa"/>
-              <w:right w:w="100.0" w:type="dxa"/>
-            </w:tcMar>
-          </w:tcPr>
-          <w:p>
-            <w:pPr>
-              <w:widowControl w:val="0"/>
-              <w:spacing w:line="240" w:lineRule="auto"/>
-              <w:rPr/>
-            </w:pPr>
-            <w:r>
-              <w:rPr>
-                <w:rtl w:val="0"/>
-              </w:rPr>
-              <w:t xml:space="preserve">Presenta pedidos disponibles</w:t>
+                <w:color w:val="0d0d0d"/>
+                <w:highlight w:val="white"/>
+                <w:rtl w:val="0"/>
+              </w:rPr>
+              <w:t xml:space="preserve">El usuario accede y visualiza la lista de pedidos disponibles en el sistema, permitiéndole consultar su información general.</w:t>
+            </w:r>
+            <w:r>
+              <w:rPr>
+                <w:rtl w:val="0"/>
+              </w:rPr>
+            </w:r>
+          </w:p>
+        </w:tc>
+        <w:tc>
+          <w:tcPr>
+            <w:tcMar>
+              <w:top w:w="100.0" w:type="dxa"/>
+              <w:left w:w="100.0" w:type="dxa"/>
+              <w:bottom w:w="100.0" w:type="dxa"/>
+              <w:right w:w="100.0" w:type="dxa"/>
+            </w:tcMar>
+          </w:tcPr>
+          <w:p>
+            <w:pPr>
+              <w:widowControl w:val="0"/>
+              <w:spacing w:line="240" w:lineRule="auto"/>
+              <w:rPr/>
+            </w:pPr>
+            <w:r>
+              <w:rPr>
+                <w:color w:val="0d0d0d"/>
+                <w:highlight w:val="white"/>
+                <w:rtl w:val="0"/>
+              </w:rPr>
+              <w:t xml:space="preserve">El sistema despliega los pedidos disponibles, permitiendo al usuario visualizar la información correspondiente para su consulta o gestión.</w:t>
+            </w:r>
+            <w:r>
+              <w:rPr>
+                <w:rtl w:val="0"/>
+              </w:rPr>
             </w:r>
           </w:p>
         </w:tc>
@@ -26088,32 +26373,46 @@
             </w:pPr>
             <w:r>
               <w:rPr>
-                <w:rtl w:val="0"/>
-              </w:rPr>
-              <w:t xml:space="preserve">Sin pedidos</w:t>
-            </w:r>
-          </w:p>
-        </w:tc>
-        <w:tc>
-          <w:tcPr>
-            <w:tcMar>
-              <w:top w:w="100.0" w:type="dxa"/>
-              <w:left w:w="100.0" w:type="dxa"/>
-              <w:bottom w:w="100.0" w:type="dxa"/>
-              <w:right w:w="100.0" w:type="dxa"/>
-            </w:tcMar>
-          </w:tcPr>
-          <w:p>
-            <w:pPr>
-              <w:widowControl w:val="0"/>
-              <w:spacing w:line="240" w:lineRule="auto"/>
-              <w:rPr/>
-            </w:pPr>
-            <w:r>
-              <w:rPr>
-                <w:rtl w:val="0"/>
-              </w:rPr>
-              <w:t xml:space="preserve">Muestra lista vacía</w:t>
+                <w:color w:val="0d0d0d"/>
+                <w:highlight w:val="white"/>
+                <w:rtl w:val="0"/>
+              </w:rPr>
+              <w:t xml:space="preserve">Si el sistema detecta que no hay pedidos disponibles, se mostrará una lista vacía y se notificará al usuario que no existen registros para visualizar</w:t>
+            </w:r>
+            <w:r>
+              <w:rPr>
+                <w:rtl w:val="0"/>
+              </w:rPr>
+            </w:r>
+          </w:p>
+        </w:tc>
+        <w:tc>
+          <w:tcPr>
+            <w:tcMar>
+              <w:top w:w="100.0" w:type="dxa"/>
+              <w:left w:w="100.0" w:type="dxa"/>
+              <w:bottom w:w="100.0" w:type="dxa"/>
+              <w:right w:w="100.0" w:type="dxa"/>
+            </w:tcMar>
+          </w:tcPr>
+          <w:p>
+            <w:pPr>
+              <w:widowControl w:val="0"/>
+              <w:spacing w:line="240" w:lineRule="auto"/>
+              <w:rPr/>
+            </w:pPr>
+            <w:r>
+              <w:rPr>
+                <w:color w:val="0d0d0d"/>
+                <w:highlight w:val="white"/>
+                <w:rtl w:val="0"/>
+              </w:rPr>
+              <w:t xml:space="preserve">El sistema despliega una lista vacía, indicando que no existen pedidos disponibles para mostrar.</w:t>
+            </w:r>
+            <w:r>
+              <w:rPr>
+                <w:rtl w:val="0"/>
+              </w:rPr>
             </w:r>
           </w:p>
         </w:tc>
@@ -26154,25 +26453,93 @@
         </w:tc>
         <w:tc>
           <w:tcPr>
-            <w:gridSpan w:val="3"/>
-            <w:tcMar>
-              <w:top w:w="100.0" w:type="dxa"/>
-              <w:left w:w="100.0" w:type="dxa"/>
-              <w:bottom w:w="100.0" w:type="dxa"/>
-              <w:right w:w="100.0" w:type="dxa"/>
-            </w:tcMar>
-          </w:tcPr>
-          <w:p>
-            <w:pPr>
-              <w:widowControl w:val="0"/>
-              <w:spacing w:line="240" w:lineRule="auto"/>
-              <w:rPr/>
-            </w:pPr>
-            <w:r>
-              <w:rPr>
-                <w:rtl w:val="0"/>
-              </w:rPr>
-              <w:t xml:space="preserve">Diaria</w:t>
+            <w:tcMar>
+              <w:top w:w="100.0" w:type="dxa"/>
+              <w:left w:w="100.0" w:type="dxa"/>
+              <w:bottom w:w="100.0" w:type="dxa"/>
+              <w:right w:w="100.0" w:type="dxa"/>
+            </w:tcMar>
+          </w:tcPr>
+          <w:p>
+            <w:pPr>
+              <w:widowControl w:val="0"/>
+              <w:spacing w:line="240" w:lineRule="auto"/>
+              <w:rPr/>
+            </w:pPr>
+            <w:r>
+              <w:rPr>
+                <w:rtl w:val="0"/>
+              </w:rPr>
+            </w:r>
+          </w:p>
+        </w:tc>
+        <w:tc>
+          <w:tcPr>
+            <w:tcMar>
+              <w:top w:w="100.0" w:type="dxa"/>
+              <w:left w:w="100.0" w:type="dxa"/>
+              <w:bottom w:w="100.0" w:type="dxa"/>
+              <w:right w:w="100.0" w:type="dxa"/>
+            </w:tcMar>
+          </w:tcPr>
+          <w:p>
+            <w:pPr>
+              <w:keepNext w:val="0"/>
+              <w:keepLines w:val="0"/>
+              <w:pageBreakBefore w:val="0"/>
+              <w:widowControl w:val="0"/>
+              <w:pBdr>
+                <w:top w:space="0" w:sz="0" w:val="nil"/>
+                <w:left w:space="0" w:sz="0" w:val="nil"/>
+                <w:bottom w:space="0" w:sz="0" w:val="nil"/>
+                <w:right w:space="0" w:sz="0" w:val="nil"/>
+                <w:between w:space="0" w:sz="0" w:val="nil"/>
+              </w:pBdr>
+              <w:shd w:fill="auto" w:val="clear"/>
+              <w:spacing w:after="0" w:before="0" w:line="276" w:lineRule="auto"/>
+              <w:ind w:left="0" w:right="0" w:firstLine="0"/>
+              <w:jc w:val="left"/>
+              <w:rPr/>
+            </w:pPr>
+            <w:r>
+              <w:rPr>
+                <w:rtl w:val="0"/>
+              </w:rPr>
+            </w:r>
+          </w:p>
+        </w:tc>
+        <w:tc>
+          <w:tcPr>
+            <w:tcMar>
+              <w:top w:w="100.0" w:type="dxa"/>
+              <w:left w:w="100.0" w:type="dxa"/>
+              <w:bottom w:w="100.0" w:type="dxa"/>
+              <w:right w:w="100.0" w:type="dxa"/>
+            </w:tcMar>
+          </w:tcPr>
+          <w:p>
+            <w:pPr>
+              <w:keepNext w:val="0"/>
+              <w:keepLines w:val="0"/>
+              <w:pageBreakBefore w:val="0"/>
+              <w:widowControl w:val="0"/>
+              <w:pBdr>
+                <w:top w:space="0" w:sz="0" w:val="nil"/>
+                <w:left w:space="0" w:sz="0" w:val="nil"/>
+                <w:bottom w:space="0" w:sz="0" w:val="nil"/>
+                <w:right w:space="0" w:sz="0" w:val="nil"/>
+                <w:between w:space="0" w:sz="0" w:val="nil"/>
+              </w:pBdr>
+              <w:shd w:fill="auto" w:val="clear"/>
+              <w:spacing w:after="0" w:before="0" w:line="276" w:lineRule="auto"/>
+              <w:ind w:left="0" w:right="0" w:firstLine="0"/>
+              <w:jc w:val="left"/>
+              <w:rPr/>
+            </w:pPr>
+            <w:r>
+              <w:rPr>
+                <w:rtl w:val="0"/>
+              </w:rPr>
             </w:r>
           </w:p>
         </w:tc>
@@ -26854,32 +27221,46 @@
             </w:pPr>
             <w:r>
               <w:rPr>
-                <w:rtl w:val="0"/>
-              </w:rPr>
-              <w:t xml:space="preserve">Selecciona pedido</w:t>
-            </w:r>
-          </w:p>
-        </w:tc>
-        <w:tc>
-          <w:tcPr>
-            <w:tcMar>
-              <w:top w:w="100.0" w:type="dxa"/>
-              <w:left w:w="100.0" w:type="dxa"/>
-              <w:bottom w:w="100.0" w:type="dxa"/>
-              <w:right w:w="100.0" w:type="dxa"/>
-            </w:tcMar>
-          </w:tcPr>
-          <w:p>
-            <w:pPr>
-              <w:widowControl w:val="0"/>
-              <w:spacing w:line="240" w:lineRule="auto"/>
-              <w:rPr/>
-            </w:pPr>
-            <w:r>
-              <w:rPr>
-                <w:rtl w:val="0"/>
-              </w:rPr>
-              <w:t xml:space="preserve">El sistema muestra estado actual</w:t>
+                <w:color w:val="0d0d0d"/>
+                <w:highlight w:val="white"/>
+                <w:rtl w:val="0"/>
+              </w:rPr>
+              <w:t xml:space="preserve">El usuario selecciona un pedido de la lista disponible, con el fin de visualizar su información o realizar acciones sobre él.</w:t>
+            </w:r>
+            <w:r>
+              <w:rPr>
+                <w:rtl w:val="0"/>
+              </w:rPr>
+            </w:r>
+          </w:p>
+        </w:tc>
+        <w:tc>
+          <w:tcPr>
+            <w:tcMar>
+              <w:top w:w="100.0" w:type="dxa"/>
+              <w:left w:w="100.0" w:type="dxa"/>
+              <w:bottom w:w="100.0" w:type="dxa"/>
+              <w:right w:w="100.0" w:type="dxa"/>
+            </w:tcMar>
+          </w:tcPr>
+          <w:p>
+            <w:pPr>
+              <w:widowControl w:val="0"/>
+              <w:spacing w:line="240" w:lineRule="auto"/>
+              <w:rPr/>
+            </w:pPr>
+            <w:r>
+              <w:rPr>
+                <w:color w:val="0d0d0d"/>
+                <w:highlight w:val="white"/>
+                <w:rtl w:val="0"/>
+              </w:rPr>
+              <w:t xml:space="preserve">El sistema despliega el estado actual del pedido, permitiendo al usuario visualizar la actualización realizada.”</w:t>
+            </w:r>
+            <w:r>
+              <w:rPr>
+                <w:rtl w:val="0"/>
+              </w:rPr>
             </w:r>
           </w:p>
         </w:tc>
@@ -26966,32 +27347,46 @@
             </w:pPr>
             <w:r>
               <w:rPr>
-                <w:rtl w:val="0"/>
-              </w:rPr>
-              <w:t xml:space="preserve">Actualiza estado</w:t>
-            </w:r>
-          </w:p>
-        </w:tc>
-        <w:tc>
-          <w:tcPr>
-            <w:tcMar>
-              <w:top w:w="100.0" w:type="dxa"/>
-              <w:left w:w="100.0" w:type="dxa"/>
-              <w:bottom w:w="100.0" w:type="dxa"/>
-              <w:right w:w="100.0" w:type="dxa"/>
-            </w:tcMar>
-          </w:tcPr>
-          <w:p>
-            <w:pPr>
-              <w:widowControl w:val="0"/>
-              <w:spacing w:line="240" w:lineRule="auto"/>
-              <w:rPr/>
-            </w:pPr>
-            <w:r>
-              <w:rPr>
-                <w:rtl w:val="0"/>
-              </w:rPr>
-              <w:t xml:space="preserve">El sistema valida cambio</w:t>
+                <w:color w:val="0d0d0d"/>
+                <w:highlight w:val="white"/>
+                <w:rtl w:val="0"/>
+              </w:rPr>
+              <w:t xml:space="preserve">El sistema realiza la actualización del estado del pedido, reflejando el cambio en la información almacenada.</w:t>
+            </w:r>
+            <w:r>
+              <w:rPr>
+                <w:rtl w:val="0"/>
+              </w:rPr>
+            </w:r>
+          </w:p>
+        </w:tc>
+        <w:tc>
+          <w:tcPr>
+            <w:tcMar>
+              <w:top w:w="100.0" w:type="dxa"/>
+              <w:left w:w="100.0" w:type="dxa"/>
+              <w:bottom w:w="100.0" w:type="dxa"/>
+              <w:right w:w="100.0" w:type="dxa"/>
+            </w:tcMar>
+          </w:tcPr>
+          <w:p>
+            <w:pPr>
+              <w:widowControl w:val="0"/>
+              <w:spacing w:line="240" w:lineRule="auto"/>
+              <w:rPr/>
+            </w:pPr>
+            <w:r>
+              <w:rPr>
+                <w:color w:val="0d0d0d"/>
+                <w:highlight w:val="white"/>
+                <w:rtl w:val="0"/>
+              </w:rPr>
+              <w:t xml:space="preserve">El sistema verifica y valida el cambio efectuado, asegurando que la actualización cumpla con las reglas y condiciones establecidas</w:t>
+            </w:r>
+            <w:r>
+              <w:rPr>
+                <w:rtl w:val="0"/>
+              </w:rPr>
             </w:r>
           </w:p>
         </w:tc>
@@ -27078,32 +27473,46 @@
             </w:pPr>
             <w:r>
               <w:rPr>
-                <w:rtl w:val="0"/>
-              </w:rPr>
-              <w:t xml:space="preserve">Guarda</w:t>
-            </w:r>
-          </w:p>
-        </w:tc>
-        <w:tc>
-          <w:tcPr>
-            <w:tcMar>
-              <w:top w:w="100.0" w:type="dxa"/>
-              <w:left w:w="100.0" w:type="dxa"/>
-              <w:bottom w:w="100.0" w:type="dxa"/>
-              <w:right w:w="100.0" w:type="dxa"/>
-            </w:tcMar>
-          </w:tcPr>
-          <w:p>
-            <w:pPr>
-              <w:widowControl w:val="0"/>
-              <w:spacing w:line="240" w:lineRule="auto"/>
-              <w:rPr/>
-            </w:pPr>
-            <w:r>
-              <w:rPr>
-                <w:rtl w:val="0"/>
-              </w:rPr>
-              <w:t xml:space="preserve">Actualiza información</w:t>
+                <w:color w:val="0d0d0d"/>
+                <w:highlight w:val="white"/>
+                <w:rtl w:val="0"/>
+              </w:rPr>
+              <w:t xml:space="preserve">El sistema almacena los cambios realizados en la base de datos, asegurando la persistencia de la información.”</w:t>
+            </w:r>
+            <w:r>
+              <w:rPr>
+                <w:rtl w:val="0"/>
+              </w:rPr>
+            </w:r>
+          </w:p>
+        </w:tc>
+        <w:tc>
+          <w:tcPr>
+            <w:tcMar>
+              <w:top w:w="100.0" w:type="dxa"/>
+              <w:left w:w="100.0" w:type="dxa"/>
+              <w:bottom w:w="100.0" w:type="dxa"/>
+              <w:right w:w="100.0" w:type="dxa"/>
+            </w:tcMar>
+          </w:tcPr>
+          <w:p>
+            <w:pPr>
+              <w:widowControl w:val="0"/>
+              <w:spacing w:line="240" w:lineRule="auto"/>
+              <w:rPr/>
+            </w:pPr>
+            <w:r>
+              <w:rPr>
+                <w:color w:val="0d0d0d"/>
+                <w:highlight w:val="white"/>
+                <w:rtl w:val="0"/>
+              </w:rPr>
+              <w:t xml:space="preserve">El sistema realiza la actualización de la información correspondiente, asegurando que los datos reflejen los cambios efectuados.</w:t>
+            </w:r>
+            <w:r>
+              <w:rPr>
+                <w:rtl w:val="0"/>
+              </w:rPr>
             </w:r>
           </w:p>
         </w:tc>
@@ -27225,6 +27634,7 @@
       <w:tr>
         <w:trPr>
           <w:cantSplit w:val="0"/>
+          <w:trHeight w:val="2064.8828125" w:hRule="atLeast"/>
           <w:tblHeader w:val="0"/>
         </w:trPr>
         <w:tc>
@@ -27306,32 +27716,46 @@
             </w:pPr>
             <w:r>
               <w:rPr>
-                <w:rtl w:val="0"/>
-              </w:rPr>
-              <w:t xml:space="preserve">Estado inválido</w:t>
-            </w:r>
-          </w:p>
-        </w:tc>
-        <w:tc>
-          <w:tcPr>
-            <w:tcMar>
-              <w:top w:w="100.0" w:type="dxa"/>
-              <w:left w:w="100.0" w:type="dxa"/>
-              <w:bottom w:w="100.0" w:type="dxa"/>
-              <w:right w:w="100.0" w:type="dxa"/>
-            </w:tcMar>
-          </w:tcPr>
-          <w:p>
-            <w:pPr>
-              <w:widowControl w:val="0"/>
-              <w:spacing w:line="240" w:lineRule="auto"/>
-              <w:rPr/>
-            </w:pPr>
-            <w:r>
-              <w:rPr>
-                <w:rtl w:val="0"/>
-              </w:rPr>
-              <w:t xml:space="preserve">Bloquea acción</w:t>
+                <w:color w:val="0d0d0d"/>
+                <w:highlight w:val="white"/>
+                <w:rtl w:val="0"/>
+              </w:rPr>
+              <w:t xml:space="preserve">Si el sistema detecta que el estado ingresado no es válido, se bloquea la operación y se notifica al usuario para que corrija la información</w:t>
+            </w:r>
+            <w:r>
+              <w:rPr>
+                <w:rtl w:val="0"/>
+              </w:rPr>
+            </w:r>
+          </w:p>
+        </w:tc>
+        <w:tc>
+          <w:tcPr>
+            <w:tcMar>
+              <w:top w:w="100.0" w:type="dxa"/>
+              <w:left w:w="100.0" w:type="dxa"/>
+              <w:bottom w:w="100.0" w:type="dxa"/>
+              <w:right w:w="100.0" w:type="dxa"/>
+            </w:tcMar>
+          </w:tcPr>
+          <w:p>
+            <w:pPr>
+              <w:widowControl w:val="0"/>
+              <w:spacing w:line="240" w:lineRule="auto"/>
+              <w:rPr/>
+            </w:pPr>
+            <w:r>
+              <w:rPr>
+                <w:color w:val="0d0d0d"/>
+                <w:highlight w:val="white"/>
+                <w:rtl w:val="0"/>
+              </w:rPr>
+              <w:t xml:space="preserve">El sistema bloquea la acción solicitada, impidiendo su ejecución debido a que no cumple con las condiciones establecidas.”</w:t>
+            </w:r>
+            <w:r>
+              <w:rPr>
+                <w:rtl w:val="0"/>
+              </w:rPr>
             </w:r>
           </w:p>
         </w:tc>
@@ -27417,32 +27841,46 @@
             </w:pPr>
             <w:r>
               <w:rPr>
-                <w:rtl w:val="0"/>
-              </w:rPr>
-              <w:t xml:space="preserve">Error en actualización</w:t>
-            </w:r>
-          </w:p>
-        </w:tc>
-        <w:tc>
-          <w:tcPr>
-            <w:tcMar>
-              <w:top w:w="100.0" w:type="dxa"/>
-              <w:left w:w="100.0" w:type="dxa"/>
-              <w:bottom w:w="100.0" w:type="dxa"/>
-              <w:right w:w="100.0" w:type="dxa"/>
-            </w:tcMar>
-          </w:tcPr>
-          <w:p>
-            <w:pPr>
-              <w:widowControl w:val="0"/>
-              <w:spacing w:line="240" w:lineRule="auto"/>
-              <w:rPr/>
-            </w:pPr>
-            <w:r>
-              <w:rPr>
-                <w:rtl w:val="0"/>
-              </w:rPr>
-              <w:t xml:space="preserve">Notifica fallo</w:t>
+                <w:color w:val="0d0d0d"/>
+                <w:highlight w:val="white"/>
+                <w:rtl w:val="0"/>
+              </w:rPr>
+              <w:t xml:space="preserve">Si el sistema detecta un error durante la actualización, se interrumpe el proceso y se notifica al usuario que no fue posible aplicar los cambios.</w:t>
+            </w:r>
+            <w:r>
+              <w:rPr>
+                <w:rtl w:val="0"/>
+              </w:rPr>
+            </w:r>
+          </w:p>
+        </w:tc>
+        <w:tc>
+          <w:tcPr>
+            <w:tcMar>
+              <w:top w:w="100.0" w:type="dxa"/>
+              <w:left w:w="100.0" w:type="dxa"/>
+              <w:bottom w:w="100.0" w:type="dxa"/>
+              <w:right w:w="100.0" w:type="dxa"/>
+            </w:tcMar>
+          </w:tcPr>
+          <w:p>
+            <w:pPr>
+              <w:widowControl w:val="0"/>
+              <w:spacing w:line="240" w:lineRule="auto"/>
+              <w:rPr/>
+            </w:pPr>
+            <w:r>
+              <w:rPr>
+                <w:color w:val="0d0d0d"/>
+                <w:highlight w:val="white"/>
+                <w:rtl w:val="0"/>
+              </w:rPr>
+              <w:t xml:space="preserve">El sistema genera y envía una notificación informando al usuario sobre el fallo ocurrido durante el proceso.</w:t>
+            </w:r>
+            <w:r>
+              <w:rPr>
+                <w:rtl w:val="0"/>
+              </w:rPr>
             </w:r>
           </w:p>
         </w:tc>
@@ -28183,32 +28621,46 @@
             </w:pPr>
             <w:r>
               <w:rPr>
-                <w:rtl w:val="0"/>
-              </w:rPr>
-              <w:t xml:space="preserve">Detecta cambio</w:t>
-            </w:r>
-          </w:p>
-        </w:tc>
-        <w:tc>
-          <w:tcPr>
-            <w:tcMar>
-              <w:top w:w="100.0" w:type="dxa"/>
-              <w:left w:w="100.0" w:type="dxa"/>
-              <w:bottom w:w="100.0" w:type="dxa"/>
-              <w:right w:w="100.0" w:type="dxa"/>
-            </w:tcMar>
-          </w:tcPr>
-          <w:p>
-            <w:pPr>
-              <w:widowControl w:val="0"/>
-              <w:spacing w:line="240" w:lineRule="auto"/>
-              <w:rPr/>
-            </w:pPr>
-            <w:r>
-              <w:rPr>
-                <w:rtl w:val="0"/>
-              </w:rPr>
-              <w:t xml:space="preserve">Genera notificación</w:t>
+                <w:color w:val="0d0d0d"/>
+                <w:highlight w:val="white"/>
+                <w:rtl w:val="0"/>
+              </w:rPr>
+              <w:t xml:space="preserve">El sistema identifica el cambio efectuado en la información, permitiendo continuar con la validación o actualización correspondiente.</w:t>
+            </w:r>
+            <w:r>
+              <w:rPr>
+                <w:rtl w:val="0"/>
+              </w:rPr>
+            </w:r>
+          </w:p>
+        </w:tc>
+        <w:tc>
+          <w:tcPr>
+            <w:tcMar>
+              <w:top w:w="100.0" w:type="dxa"/>
+              <w:left w:w="100.0" w:type="dxa"/>
+              <w:bottom w:w="100.0" w:type="dxa"/>
+              <w:right w:w="100.0" w:type="dxa"/>
+            </w:tcMar>
+          </w:tcPr>
+          <w:p>
+            <w:pPr>
+              <w:widowControl w:val="0"/>
+              <w:spacing w:line="240" w:lineRule="auto"/>
+              <w:rPr/>
+            </w:pPr>
+            <w:r>
+              <w:rPr>
+                <w:color w:val="0d0d0d"/>
+                <w:highlight w:val="white"/>
+                <w:rtl w:val="0"/>
+              </w:rPr>
+              <w:t xml:space="preserve">El sistema genera una notificación informando al usuario sobre el cambio o resultado del proceso realizado.</w:t>
+            </w:r>
+            <w:r>
+              <w:rPr>
+                <w:rtl w:val="0"/>
+              </w:rPr>
             </w:r>
           </w:p>
         </w:tc>
@@ -28295,31 +28747,46 @@
             </w:pPr>
             <w:r>
               <w:rPr>
-                <w:rtl w:val="0"/>
-              </w:rPr>
-            </w:r>
-          </w:p>
-        </w:tc>
-        <w:tc>
-          <w:tcPr>
-            <w:tcMar>
-              <w:top w:w="100.0" w:type="dxa"/>
-              <w:left w:w="100.0" w:type="dxa"/>
-              <w:bottom w:w="100.0" w:type="dxa"/>
-              <w:right w:w="100.0" w:type="dxa"/>
-            </w:tcMar>
-          </w:tcPr>
-          <w:p>
-            <w:pPr>
-              <w:widowControl w:val="0"/>
-              <w:spacing w:line="240" w:lineRule="auto"/>
-              <w:rPr/>
-            </w:pPr>
-            <w:r>
-              <w:rPr>
-                <w:rtl w:val="0"/>
-              </w:rPr>
-              <w:t xml:space="preserve">Envía notificación</w:t>
+                <w:color w:val="0d0d0d"/>
+                <w:highlight w:val="white"/>
+                <w:rtl w:val="0"/>
+              </w:rPr>
+              <w:t xml:space="preserve">El usuario confirma el cambio realizado, autorizando al sistema a aplicar la actualización correspondiente.</w:t>
+            </w:r>
+            <w:r>
+              <w:rPr>
+                <w:rtl w:val="0"/>
+              </w:rPr>
+            </w:r>
+          </w:p>
+        </w:tc>
+        <w:tc>
+          <w:tcPr>
+            <w:tcMar>
+              <w:top w:w="100.0" w:type="dxa"/>
+              <w:left w:w="100.0" w:type="dxa"/>
+              <w:bottom w:w="100.0" w:type="dxa"/>
+              <w:right w:w="100.0" w:type="dxa"/>
+            </w:tcMar>
+          </w:tcPr>
+          <w:p>
+            <w:pPr>
+              <w:widowControl w:val="0"/>
+              <w:spacing w:line="240" w:lineRule="auto"/>
+              <w:rPr/>
+            </w:pPr>
+            <w:r>
+              <w:rPr>
+                <w:color w:val="0d0d0d"/>
+                <w:highlight w:val="white"/>
+                <w:rtl w:val="0"/>
+              </w:rPr>
+              <w:t xml:space="preserve">El sistema genera una notificación informando al usuario sobre el cambio o resultado del proceso realizado.</w:t>
+            </w:r>
+            <w:r>
+              <w:rPr>
+                <w:rtl w:val="0"/>
+              </w:rPr>
             </w:r>
           </w:p>
         </w:tc>
@@ -28522,32 +28989,46 @@
             </w:pPr>
             <w:r>
               <w:rPr>
-                <w:rtl w:val="0"/>
-              </w:rPr>
-              <w:t xml:space="preserve">Error de envío</w:t>
-            </w:r>
-          </w:p>
-        </w:tc>
-        <w:tc>
-          <w:tcPr>
-            <w:tcMar>
-              <w:top w:w="100.0" w:type="dxa"/>
-              <w:left w:w="100.0" w:type="dxa"/>
-              <w:bottom w:w="100.0" w:type="dxa"/>
-              <w:right w:w="100.0" w:type="dxa"/>
-            </w:tcMar>
-          </w:tcPr>
-          <w:p>
-            <w:pPr>
-              <w:widowControl w:val="0"/>
-              <w:spacing w:line="240" w:lineRule="auto"/>
-              <w:rPr/>
-            </w:pPr>
-            <w:r>
-              <w:rPr>
-                <w:rtl w:val="0"/>
-              </w:rPr>
-              <w:t xml:space="preserve">Registra error</w:t>
+                <w:color w:val="0d0d0d"/>
+                <w:highlight w:val="white"/>
+                <w:rtl w:val="0"/>
+              </w:rPr>
+              <w:t xml:space="preserve">Si el sistema detecta un error durante el envío, se interrumpe el proceso y se notifica al usuario que no fue posible completar la operación.</w:t>
+            </w:r>
+            <w:r>
+              <w:rPr>
+                <w:rtl w:val="0"/>
+              </w:rPr>
+            </w:r>
+          </w:p>
+        </w:tc>
+        <w:tc>
+          <w:tcPr>
+            <w:tcMar>
+              <w:top w:w="100.0" w:type="dxa"/>
+              <w:left w:w="100.0" w:type="dxa"/>
+              <w:bottom w:w="100.0" w:type="dxa"/>
+              <w:right w:w="100.0" w:type="dxa"/>
+            </w:tcMar>
+          </w:tcPr>
+          <w:p>
+            <w:pPr>
+              <w:widowControl w:val="0"/>
+              <w:spacing w:line="240" w:lineRule="auto"/>
+              <w:rPr/>
+            </w:pPr>
+            <w:r>
+              <w:rPr>
+                <w:color w:val="0d0d0d"/>
+                <w:highlight w:val="white"/>
+                <w:rtl w:val="0"/>
+              </w:rPr>
+              <w:t xml:space="preserve">El sistema registra el error detectado, almacenando la información correspondiente para su seguimiento y análisis.</w:t>
+            </w:r>
+            <w:r>
+              <w:rPr>
+                <w:rtl w:val="0"/>
+              </w:rPr>
             </w:r>
           </w:p>
         </w:tc>
@@ -29288,32 +29769,46 @@
             </w:pPr>
             <w:r>
               <w:rPr>
-                <w:rtl w:val="0"/>
-              </w:rPr>
-              <w:t xml:space="preserve">Solicita rutas</w:t>
-            </w:r>
-          </w:p>
-        </w:tc>
-        <w:tc>
-          <w:tcPr>
-            <w:tcMar>
-              <w:top w:w="100.0" w:type="dxa"/>
-              <w:left w:w="100.0" w:type="dxa"/>
-              <w:bottom w:w="100.0" w:type="dxa"/>
-              <w:right w:w="100.0" w:type="dxa"/>
-            </w:tcMar>
-          </w:tcPr>
-          <w:p>
-            <w:pPr>
-              <w:widowControl w:val="0"/>
-              <w:spacing w:line="240" w:lineRule="auto"/>
-              <w:rPr/>
-            </w:pPr>
-            <w:r>
-              <w:rPr>
-                <w:rtl w:val="0"/>
-              </w:rPr>
-              <w:t xml:space="preserve">Muestra ruta</w:t>
+                <w:color w:val="0d0d0d"/>
+                <w:highlight w:val="white"/>
+                <w:rtl w:val="0"/>
+              </w:rPr>
+              <w:t xml:space="preserve">El usuario solicita la consulta de rutas disponibles en el sistema, con el fin de visualizar la información correspondiente para su selección o análisis.</w:t>
+            </w:r>
+            <w:r>
+              <w:rPr>
+                <w:rtl w:val="0"/>
+              </w:rPr>
+            </w:r>
+          </w:p>
+        </w:tc>
+        <w:tc>
+          <w:tcPr>
+            <w:tcMar>
+              <w:top w:w="100.0" w:type="dxa"/>
+              <w:left w:w="100.0" w:type="dxa"/>
+              <w:bottom w:w="100.0" w:type="dxa"/>
+              <w:right w:w="100.0" w:type="dxa"/>
+            </w:tcMar>
+          </w:tcPr>
+          <w:p>
+            <w:pPr>
+              <w:widowControl w:val="0"/>
+              <w:spacing w:line="240" w:lineRule="auto"/>
+              <w:rPr/>
+            </w:pPr>
+            <w:r>
+              <w:rPr>
+                <w:color w:val="0d0d0d"/>
+                <w:highlight w:val="white"/>
+                <w:rtl w:val="0"/>
+              </w:rPr>
+              <w:t xml:space="preserve">El sistema despliega la ruta correspondiente, permitiendo al usuario visualizar la información detallada para su consulta o seguimiento.</w:t>
+            </w:r>
+            <w:r>
+              <w:rPr>
+                <w:rtl w:val="0"/>
+              </w:rPr>
             </w:r>
           </w:p>
         </w:tc>
@@ -29516,32 +30011,46 @@
             </w:pPr>
             <w:r>
               <w:rPr>
-                <w:rtl w:val="0"/>
-              </w:rPr>
-              <w:t xml:space="preserve">Pedido inexistente</w:t>
-            </w:r>
-          </w:p>
-        </w:tc>
-        <w:tc>
-          <w:tcPr>
-            <w:tcMar>
-              <w:top w:w="100.0" w:type="dxa"/>
-              <w:left w:w="100.0" w:type="dxa"/>
-              <w:bottom w:w="100.0" w:type="dxa"/>
-              <w:right w:w="100.0" w:type="dxa"/>
-            </w:tcMar>
-          </w:tcPr>
-          <w:p>
-            <w:pPr>
-              <w:widowControl w:val="0"/>
-              <w:spacing w:line="240" w:lineRule="auto"/>
-              <w:rPr/>
-            </w:pPr>
-            <w:r>
-              <w:rPr>
-                <w:rtl w:val="0"/>
-              </w:rPr>
-              <w:t xml:space="preserve">Muestra error</w:t>
+                <w:color w:val="0d0d0d"/>
+                <w:highlight w:val="white"/>
+                <w:rtl w:val="0"/>
+              </w:rPr>
+              <w:t xml:space="preserve">Si el sistema detecta que el pedido no existe, se interrumpe el proceso y se notifica al usuario que no es posible continuar con la operación.</w:t>
+            </w:r>
+            <w:r>
+              <w:rPr>
+                <w:rtl w:val="0"/>
+              </w:rPr>
+            </w:r>
+          </w:p>
+        </w:tc>
+        <w:tc>
+          <w:tcPr>
+            <w:tcMar>
+              <w:top w:w="100.0" w:type="dxa"/>
+              <w:left w:w="100.0" w:type="dxa"/>
+              <w:bottom w:w="100.0" w:type="dxa"/>
+              <w:right w:w="100.0" w:type="dxa"/>
+            </w:tcMar>
+          </w:tcPr>
+          <w:p>
+            <w:pPr>
+              <w:widowControl w:val="0"/>
+              <w:spacing w:line="240" w:lineRule="auto"/>
+              <w:rPr/>
+            </w:pPr>
+            <w:r>
+              <w:rPr>
+                <w:color w:val="0d0d0d"/>
+                <w:highlight w:val="white"/>
+                <w:rtl w:val="0"/>
+              </w:rPr>
+              <w:t xml:space="preserve">El sistema despliega un mensaje de error informando que no fue posible completar la operación solicitada</w:t>
+            </w:r>
+            <w:r>
+              <w:rPr>
+                <w:rtl w:val="0"/>
+              </w:rPr>
             </w:r>
           </w:p>
         </w:tc>
@@ -29735,12 +30244,28 @@
       </w:r>
     </w:p>
     <w:sectPr>
+      <w:headerReference r:id="rId12" w:type="default"/>
       <w:pgSz w:h="15840" w:w="12240" w:orient="portrait"/>
       <w:pgMar w:bottom="1417" w:top="1417" w:left="1701" w:right="1701" w:header="708" w:footer="708"/>
       <w:pgNumType w:start="1"/>
     </w:sectPr>
   </w:body>
 </w:document>
+</file>
+
+<file path=word/header1.xml><?xml version="1.0" encoding="utf-8"?>
+<w:hdr xmlns:mc="http://schemas.openxmlformats.org/markup-compatibility/2006" xmlns:o="urn:schemas-microsoft-com:office:office" xmlns:r="http://schemas.openxmlformats.org/officeDocument/2006/relationships" xmlns:m="http://schemas.openxmlformats.org/officeDocument/2006/math" xmlns:v="urn:schemas-microsoft-com:vml" xmlns:wp="http://schemas.openxmlformats.org/drawingml/2006/wordprocessingDrawing" xmlns:w10="urn:schemas-microsoft-com:office:word" xmlns:w="http://schemas.openxmlformats.org/wordprocessingml/2006/main" xmlns:wne="http://schemas.microsoft.com/office/word/2006/wordml" xmlns:sl="http://schemas.openxmlformats.org/schemaLibrary/2006/main" xmlns:a="http://schemas.openxmlformats.org/drawingml/2006/main" xmlns:pic="http://schemas.openxmlformats.org/drawingml/2006/picture" xmlns:c="http://schemas.openxmlformats.org/drawingml/2006/chart" xmlns:lc="http://schemas.openxmlformats.org/drawingml/2006/lockedCanvas" xmlns:dgm="http://schemas.openxmlformats.org/drawingml/2006/diagram" xmlns:wps="http://schemas.microsoft.com/office/word/2010/wordprocessingShape" xmlns:wpg="http://schemas.microsoft.com/office/word/2010/wordprocessingGroup" xmlns:w14="http://schemas.microsoft.com/office/word/2010/wordml" xmlns:w15="http://schemas.microsoft.com/office/word/2012/wordml" xmlns:w16="http://schemas.microsoft.com/office/word/2018/wordml" xmlns:w16cex="http://schemas.microsoft.com/office/word/2018/wordml/cex" xmlns:w16cid="http://schemas.microsoft.com/office/word/2016/wordml/cid" xmlns="http://schemas.microsoft.com/office/tasks/2019/documenttasks" xmlns:cr="http://schemas.microsoft.com/office/comments/2020/reactions">
+  <w:p>
+    <w:pPr>
+      <w:rPr/>
+    </w:pPr>
+    <w:r>
+      <w:rPr>
+        <w:rtl w:val="0"/>
+      </w:rPr>
+    </w:r>
+  </w:p>
+</w:hdr>
 </file>
 
 <file path=word/numbering.xml><?xml version="1.0" encoding="utf-8"?>

</xml_diff>